<commit_message>
save rpd to pdf
</commit_message>
<xml_diff>
--- a/templates/docxRPD/rpd_asp.docx
+++ b/templates/docxRPD/rpd_asp.docx
@@ -83,7 +83,6 @@
         </w:rPr>
         <w:t xml:space="preserve">Структурное подразделение </w:t>
       </w:r>
-      <w:proofErr w:type="gramStart"/>
       <w:r>
         <w:rPr>
           <w:rFonts w:ascii="Times New Roman" w:hAnsi="Times New Roman" w:cs="Times New Roman"/>
@@ -101,7 +100,6 @@
         </w:rPr>
         <w:t>kaf</w:t>
       </w:r>
-      <w:proofErr w:type="gramEnd"/>
       <w:r>
         <w:rPr>
           <w:rFonts w:ascii="Times New Roman" w:hAnsi="Times New Roman" w:cs="Times New Roman"/>
@@ -110,7 +108,6 @@
         </w:rPr>
         <w:t>_</w:t>
       </w:r>
-      <w:proofErr w:type="gramStart"/>
       <w:r>
         <w:rPr>
           <w:rFonts w:ascii="Times New Roman" w:hAnsi="Times New Roman" w:cs="Times New Roman"/>
@@ -126,16 +123,7 @@
           <w:sz w:val="24"/>
           <w:szCs w:val="24"/>
         </w:rPr>
-        <w:t xml:space="preserve"> }</w:t>
-      </w:r>
-      <w:proofErr w:type="gramEnd"/>
-      <w:r>
-        <w:rPr>
-          <w:rFonts w:ascii="Times New Roman" w:hAnsi="Times New Roman" w:cs="Times New Roman"/>
-          <w:sz w:val="24"/>
-          <w:szCs w:val="24"/>
-        </w:rPr>
-        <w:t xml:space="preserve">} </w:t>
+        <w:t xml:space="preserve"> }} </w:t>
       </w:r>
     </w:p>
     <w:p>
@@ -179,7 +167,6 @@
         </w:rPr>
         <w:t xml:space="preserve">на </w:t>
       </w:r>
-      <w:proofErr w:type="gramStart"/>
       <w:r>
         <w:rPr>
           <w:rFonts w:ascii="Times New Roman" w:hAnsi="Times New Roman" w:cs="Times New Roman"/>
@@ -197,7 +184,6 @@
         </w:rPr>
         <w:t>meeting</w:t>
       </w:r>
-      <w:proofErr w:type="gramEnd"/>
       <w:r>
         <w:rPr>
           <w:rFonts w:ascii="Times New Roman" w:hAnsi="Times New Roman" w:cs="Times New Roman"/>
@@ -231,16 +217,79 @@
           <w:sz w:val="24"/>
           <w:szCs w:val="24"/>
         </w:rPr>
+        <w:t xml:space="preserve"> №</w:t>
+      </w:r>
+      <w:r>
+        <w:rPr>
+          <w:rFonts w:ascii="Times New Roman" w:hAnsi="Times New Roman" w:cs="Times New Roman"/>
+          <w:sz w:val="24"/>
+          <w:szCs w:val="24"/>
+          <w:u w:val="single"/>
+        </w:rPr>
+        <w:t xml:space="preserve">{{ </w:t>
+      </w:r>
+      <w:r>
+        <w:rPr>
+          <w:rFonts w:ascii="Times New Roman" w:hAnsi="Times New Roman" w:cs="Times New Roman"/>
+          <w:sz w:val="24"/>
+          <w:szCs w:val="24"/>
+          <w:u w:val="single"/>
+          <w:lang w:val="en-US"/>
+        </w:rPr>
+        <w:t>protocol</w:t>
+      </w:r>
+      <w:r>
+        <w:rPr>
+          <w:rFonts w:ascii="Times New Roman" w:hAnsi="Times New Roman" w:cs="Times New Roman"/>
+          <w:sz w:val="24"/>
+          <w:szCs w:val="24"/>
+          <w:u w:val="single"/>
+        </w:rPr>
+        <w:t>_</w:t>
+      </w:r>
+      <w:proofErr w:type="spellStart"/>
+      <w:r>
+        <w:rPr>
+          <w:rFonts w:ascii="Times New Roman" w:hAnsi="Times New Roman" w:cs="Times New Roman"/>
+          <w:sz w:val="24"/>
+          <w:szCs w:val="24"/>
+          <w:u w:val="single"/>
+        </w:rPr>
+        <w:t>number</w:t>
+      </w:r>
+      <w:proofErr w:type="spellEnd"/>
+      <w:r>
+        <w:rPr>
+          <w:rFonts w:ascii="Times New Roman" w:hAnsi="Times New Roman" w:cs="Times New Roman"/>
+          <w:sz w:val="24"/>
+          <w:szCs w:val="24"/>
+          <w:u w:val="single"/>
+        </w:rPr>
+        <w:t xml:space="preserve"> }}</w:t>
+      </w:r>
+      <w:r>
+        <w:rPr>
+          <w:rFonts w:ascii="Times New Roman" w:hAnsi="Times New Roman" w:cs="Times New Roman"/>
+          <w:sz w:val="24"/>
+          <w:szCs w:val="24"/>
+        </w:rPr>
         <w:t xml:space="preserve"> </w:t>
       </w:r>
-      <w:proofErr w:type="gramStart"/>
-      <w:r>
-        <w:rPr>
-          <w:rFonts w:ascii="Times New Roman" w:hAnsi="Times New Roman" w:cs="Times New Roman"/>
-          <w:sz w:val="24"/>
-          <w:szCs w:val="24"/>
-        </w:rPr>
-        <w:t>№</w:t>
+      <w:r>
+        <w:rPr>
+          <w:rFonts w:ascii="Times New Roman" w:hAnsi="Times New Roman" w:cs="Times New Roman"/>
+          <w:sz w:val="24"/>
+          <w:szCs w:val="24"/>
+        </w:rPr>
+        <w:t>от</w:t>
+      </w:r>
+      <w:r>
+        <w:rPr>
+          <w:rFonts w:ascii="Times New Roman" w:hAnsi="Times New Roman" w:cs="Times New Roman"/>
+          <w:sz w:val="24"/>
+          <w:szCs w:val="24"/>
+        </w:rPr>
+        <w:t xml:space="preserve"> </w:t>
       </w:r>
       <w:r>
         <w:rPr>
@@ -261,7 +310,6 @@
         </w:rPr>
         <w:t>protocol</w:t>
       </w:r>
-      <w:proofErr w:type="gramEnd"/>
       <w:r>
         <w:rPr>
           <w:rFonts w:ascii="Times New Roman" w:hAnsi="Times New Roman" w:cs="Times New Roman"/>
@@ -271,18 +319,16 @@
         </w:rPr>
         <w:t>_</w:t>
       </w:r>
-      <w:proofErr w:type="spellStart"/>
-      <w:proofErr w:type="gramStart"/>
       <w:r>
         <w:rPr>
           <w:rFonts w:ascii="Times New Roman" w:hAnsi="Times New Roman" w:cs="Times New Roman"/>
           <w:sz w:val="24"/>
           <w:szCs w:val="24"/>
           <w:u w:val="single"/>
-        </w:rPr>
-        <w:t>number</w:t>
-      </w:r>
-      <w:proofErr w:type="spellEnd"/>
+          <w:lang w:val="en-US"/>
+        </w:rPr>
+        <w:t>date</w:t>
+      </w:r>
       <w:r>
         <w:rPr>
           <w:rFonts w:ascii="Times New Roman" w:hAnsi="Times New Roman" w:cs="Times New Roman"/>
@@ -290,101 +336,7 @@
           <w:szCs w:val="24"/>
           <w:u w:val="single"/>
         </w:rPr>
-        <w:t xml:space="preserve"> }</w:t>
-      </w:r>
-      <w:proofErr w:type="gramEnd"/>
-      <w:r>
-        <w:rPr>
-          <w:rFonts w:ascii="Times New Roman" w:hAnsi="Times New Roman" w:cs="Times New Roman"/>
-          <w:sz w:val="24"/>
-          <w:szCs w:val="24"/>
-          <w:u w:val="single"/>
-        </w:rPr>
-        <w:t>}</w:t>
-      </w:r>
-      <w:r>
-        <w:rPr>
-          <w:rFonts w:ascii="Times New Roman" w:hAnsi="Times New Roman" w:cs="Times New Roman"/>
-          <w:sz w:val="24"/>
-          <w:szCs w:val="24"/>
-        </w:rPr>
-        <w:t xml:space="preserve"> </w:t>
-      </w:r>
-      <w:r>
-        <w:rPr>
-          <w:rFonts w:ascii="Times New Roman" w:hAnsi="Times New Roman" w:cs="Times New Roman"/>
-          <w:sz w:val="24"/>
-          <w:szCs w:val="24"/>
-        </w:rPr>
-        <w:t>от</w:t>
-      </w:r>
-      <w:r>
-        <w:rPr>
-          <w:rFonts w:ascii="Times New Roman" w:hAnsi="Times New Roman" w:cs="Times New Roman"/>
-          <w:sz w:val="24"/>
-          <w:szCs w:val="24"/>
-        </w:rPr>
-        <w:t xml:space="preserve"> </w:t>
-      </w:r>
-      <w:proofErr w:type="gramStart"/>
-      <w:r>
-        <w:rPr>
-          <w:rFonts w:ascii="Times New Roman" w:hAnsi="Times New Roman" w:cs="Times New Roman"/>
-          <w:sz w:val="24"/>
-          <w:szCs w:val="24"/>
-          <w:u w:val="single"/>
-        </w:rPr>
-        <w:t xml:space="preserve">{{ </w:t>
-      </w:r>
-      <w:r>
-        <w:rPr>
-          <w:rFonts w:ascii="Times New Roman" w:hAnsi="Times New Roman" w:cs="Times New Roman"/>
-          <w:sz w:val="24"/>
-          <w:szCs w:val="24"/>
-          <w:u w:val="single"/>
-          <w:lang w:val="en-US"/>
-        </w:rPr>
-        <w:t>protocol</w:t>
-      </w:r>
-      <w:proofErr w:type="gramEnd"/>
-      <w:r>
-        <w:rPr>
-          <w:rFonts w:ascii="Times New Roman" w:hAnsi="Times New Roman" w:cs="Times New Roman"/>
-          <w:sz w:val="24"/>
-          <w:szCs w:val="24"/>
-          <w:u w:val="single"/>
-        </w:rPr>
-        <w:t>_</w:t>
-      </w:r>
-      <w:proofErr w:type="gramStart"/>
-      <w:r>
-        <w:rPr>
-          <w:rFonts w:ascii="Times New Roman" w:hAnsi="Times New Roman" w:cs="Times New Roman"/>
-          <w:sz w:val="24"/>
-          <w:szCs w:val="24"/>
-          <w:u w:val="single"/>
-          <w:lang w:val="en-US"/>
-        </w:rPr>
-        <w:t>date</w:t>
-      </w:r>
-      <w:r>
-        <w:rPr>
-          <w:rFonts w:ascii="Times New Roman" w:hAnsi="Times New Roman" w:cs="Times New Roman"/>
-          <w:sz w:val="24"/>
-          <w:szCs w:val="24"/>
-          <w:u w:val="single"/>
-        </w:rPr>
-        <w:t xml:space="preserve"> }</w:t>
-      </w:r>
-      <w:proofErr w:type="gramEnd"/>
-      <w:r>
-        <w:rPr>
-          <w:rFonts w:ascii="Times New Roman" w:hAnsi="Times New Roman" w:cs="Times New Roman"/>
-          <w:sz w:val="24"/>
-          <w:szCs w:val="24"/>
-          <w:u w:val="single"/>
-        </w:rPr>
-        <w:t>}</w:t>
+        <w:t xml:space="preserve"> }}</w:t>
       </w:r>
       <w:r>
         <w:rPr>
@@ -573,7 +525,6 @@
               </w:rPr>
               <w:t xml:space="preserve">Научная специальность: </w:t>
             </w:r>
-            <w:proofErr w:type="gramStart"/>
             <w:r>
               <w:rPr>
                 <w:rFonts w:ascii="Times New Roman" w:hAnsi="Times New Roman" w:cs="Times New Roman"/>
@@ -592,7 +543,6 @@
               <w:t>asp</w:t>
             </w:r>
             <w:proofErr w:type="spellEnd"/>
-            <w:proofErr w:type="gramEnd"/>
             <w:r>
               <w:rPr>
                 <w:rFonts w:ascii="Times New Roman" w:hAnsi="Times New Roman" w:cs="Times New Roman"/>
@@ -601,7 +551,6 @@
               </w:rPr>
               <w:t>_</w:t>
             </w:r>
-            <w:proofErr w:type="gramStart"/>
             <w:r>
               <w:rPr>
                 <w:rFonts w:ascii="Times New Roman" w:hAnsi="Times New Roman" w:cs="Times New Roman"/>
@@ -617,25 +566,7 @@
                 <w:sz w:val="24"/>
                 <w:szCs w:val="24"/>
               </w:rPr>
-              <w:t xml:space="preserve"> }</w:t>
-            </w:r>
-            <w:proofErr w:type="gramEnd"/>
-            <w:r>
-              <w:rPr>
-                <w:rFonts w:ascii="Times New Roman" w:hAnsi="Times New Roman" w:cs="Times New Roman"/>
-                <w:sz w:val="24"/>
-                <w:szCs w:val="24"/>
-              </w:rPr>
-              <w:t xml:space="preserve">} </w:t>
-            </w:r>
-            <w:proofErr w:type="gramStart"/>
-            <w:r>
-              <w:rPr>
-                <w:rFonts w:ascii="Times New Roman" w:hAnsi="Times New Roman" w:cs="Times New Roman"/>
-                <w:sz w:val="24"/>
-                <w:szCs w:val="24"/>
-              </w:rPr>
-              <w:t xml:space="preserve">{{ </w:t>
+              <w:t xml:space="preserve"> }} {{ </w:t>
             </w:r>
             <w:r>
               <w:rPr>
@@ -646,7 +577,6 @@
               </w:rPr>
               <w:t>asp</w:t>
             </w:r>
-            <w:proofErr w:type="gramEnd"/>
             <w:r>
               <w:rPr>
                 <w:rFonts w:ascii="Times New Roman" w:hAnsi="Times New Roman" w:cs="Times New Roman"/>
@@ -771,7 +701,6 @@
                 <w:lang w:val="en-US"/>
               </w:rPr>
             </w:pPr>
-            <w:proofErr w:type="gramStart"/>
             <w:r>
               <w:rPr>
                 <w:rFonts w:ascii="Times New Roman" w:hAnsi="Times New Roman" w:cs="Times New Roman"/>
@@ -789,19 +718,8 @@
                 <w:szCs w:val="24"/>
                 <w:lang w:val="en-US"/>
               </w:rPr>
-              <w:t>asp</w:t>
-            </w:r>
-            <w:proofErr w:type="gramEnd"/>
-            <w:r>
-              <w:rPr>
-                <w:rFonts w:ascii="Times New Roman" w:hAnsi="Times New Roman" w:cs="Times New Roman"/>
-                <w:sz w:val="24"/>
-                <w:szCs w:val="24"/>
-                <w:lang w:val="en-US"/>
-              </w:rPr>
-              <w:t>_</w:t>
-            </w:r>
-            <w:proofErr w:type="gramStart"/>
+              <w:t>asp_</w:t>
+            </w:r>
             <w:r>
               <w:rPr>
                 <w:rFonts w:ascii="Times New Roman" w:hAnsi="Times New Roman" w:cs="Times New Roman"/>
@@ -819,17 +737,7 @@
                 <w:szCs w:val="24"/>
                 <w:lang w:val="en-US"/>
               </w:rPr>
-              <w:t xml:space="preserve"> }</w:t>
-            </w:r>
-            <w:proofErr w:type="gramEnd"/>
-            <w:r>
-              <w:rPr>
-                <w:rFonts w:ascii="Times New Roman" w:hAnsi="Times New Roman" w:cs="Times New Roman"/>
-                <w:sz w:val="24"/>
-                <w:szCs w:val="24"/>
-                <w:lang w:val="en-US"/>
-              </w:rPr>
-              <w:t xml:space="preserve">} </w:t>
+              <w:t xml:space="preserve"> }} </w:t>
             </w:r>
           </w:p>
         </w:tc>
@@ -922,27 +830,7 @@
           <w:szCs w:val="24"/>
           <w:lang w:val="en-US"/>
         </w:rPr>
-        <w:t xml:space="preserve">{% if status == </w:t>
-      </w:r>
-      <w:proofErr w:type="gramStart"/>
-      <w:r>
-        <w:rPr>
-          <w:rFonts w:ascii="Times New Roman" w:hAnsi="Times New Roman" w:cs="Times New Roman"/>
-          <w:sz w:val="24"/>
-          <w:szCs w:val="24"/>
-          <w:lang w:val="en-US"/>
-        </w:rPr>
-        <w:t>3  %</w:t>
-      </w:r>
-      <w:proofErr w:type="gramEnd"/>
-      <w:r>
-        <w:rPr>
-          <w:rFonts w:ascii="Times New Roman" w:hAnsi="Times New Roman" w:cs="Times New Roman"/>
-          <w:sz w:val="24"/>
-          <w:szCs w:val="24"/>
-          <w:lang w:val="en-US"/>
-        </w:rPr>
-        <w:t>}</w:t>
+        <w:t>{% if status == 3  %}</w:t>
       </w:r>
     </w:p>
     <w:tbl>
@@ -995,14 +883,64 @@
                 <w:sz w:val="20"/>
                 <w:szCs w:val="24"/>
               </w:rPr>
-              <w:t xml:space="preserve">Составитель программы: </w:t>
-            </w:r>
-            <w:proofErr w:type="gramStart"/>
+              <w:t xml:space="preserve">Составитель программы: {{ </w:t>
+            </w:r>
             <w:r>
               <w:rPr>
                 <w:rFonts w:ascii="Times New Roman" w:hAnsi="Times New Roman" w:cs="Times New Roman"/>
                 <w:sz w:val="20"/>
                 <w:szCs w:val="24"/>
+                <w:lang w:val="en-US"/>
+              </w:rPr>
+              <w:t>person</w:t>
+            </w:r>
+            <w:r>
+              <w:rPr>
+                <w:rFonts w:ascii="Times New Roman" w:hAnsi="Times New Roman" w:cs="Times New Roman"/>
+                <w:sz w:val="20"/>
+                <w:szCs w:val="24"/>
+              </w:rPr>
+              <w:t>_</w:t>
+            </w:r>
+            <w:r>
+              <w:rPr>
+                <w:rFonts w:ascii="Times New Roman" w:hAnsi="Times New Roman" w:cs="Times New Roman"/>
+                <w:sz w:val="20"/>
+                <w:szCs w:val="24"/>
+                <w:lang w:val="en-US"/>
+              </w:rPr>
+              <w:t>name</w:t>
+            </w:r>
+            <w:r>
+              <w:rPr>
+                <w:rFonts w:ascii="Times New Roman" w:hAnsi="Times New Roman" w:cs="Times New Roman"/>
+                <w:sz w:val="20"/>
+                <w:szCs w:val="24"/>
+              </w:rPr>
+              <w:t xml:space="preserve"> }}</w:t>
+            </w:r>
+          </w:p>
+          <w:p>
+            <w:pPr>
+              <w:rPr>
+                <w:rFonts w:ascii="Times New Roman" w:hAnsi="Times New Roman" w:cs="Times New Roman"/>
+                <w:sz w:val="20"/>
+                <w:szCs w:val="24"/>
+              </w:rPr>
+            </w:pPr>
+            <w:r>
+              <w:rPr>
+                <w:rFonts w:ascii="Times New Roman" w:hAnsi="Times New Roman" w:cs="Times New Roman"/>
+                <w:sz w:val="20"/>
+                <w:szCs w:val="24"/>
+              </w:rPr>
+              <w:t xml:space="preserve">Дата подписания: </w:t>
+            </w:r>
+            <w:r>
+              <w:rPr>
+                <w:rFonts w:ascii="Times New Roman" w:hAnsi="Times New Roman" w:cs="Times New Roman"/>
+                <w:sz w:val="20"/>
+                <w:szCs w:val="24"/>
               </w:rPr>
               <w:t xml:space="preserve">{{ </w:t>
             </w:r>
@@ -1013,80 +951,8 @@
                 <w:szCs w:val="24"/>
                 <w:lang w:val="en-US"/>
               </w:rPr>
-              <w:t>person</w:t>
-            </w:r>
-            <w:proofErr w:type="gramEnd"/>
-            <w:r>
-              <w:rPr>
-                <w:rFonts w:ascii="Times New Roman" w:hAnsi="Times New Roman" w:cs="Times New Roman"/>
-                <w:sz w:val="20"/>
-                <w:szCs w:val="24"/>
-              </w:rPr>
-              <w:t>_</w:t>
-            </w:r>
-            <w:proofErr w:type="gramStart"/>
-            <w:r>
-              <w:rPr>
-                <w:rFonts w:ascii="Times New Roman" w:hAnsi="Times New Roman" w:cs="Times New Roman"/>
-                <w:sz w:val="20"/>
-                <w:szCs w:val="24"/>
-                <w:lang w:val="en-US"/>
-              </w:rPr>
-              <w:t>name</w:t>
-            </w:r>
-            <w:r>
-              <w:rPr>
-                <w:rFonts w:ascii="Times New Roman" w:hAnsi="Times New Roman" w:cs="Times New Roman"/>
-                <w:sz w:val="20"/>
-                <w:szCs w:val="24"/>
-              </w:rPr>
-              <w:t xml:space="preserve"> }</w:t>
-            </w:r>
-            <w:proofErr w:type="gramEnd"/>
-            <w:r>
-              <w:rPr>
-                <w:rFonts w:ascii="Times New Roman" w:hAnsi="Times New Roman" w:cs="Times New Roman"/>
-                <w:sz w:val="20"/>
-                <w:szCs w:val="24"/>
-              </w:rPr>
-              <w:t>}</w:t>
-            </w:r>
-          </w:p>
-          <w:p>
-            <w:pPr>
-              <w:rPr>
-                <w:rFonts w:ascii="Times New Roman" w:hAnsi="Times New Roman" w:cs="Times New Roman"/>
-                <w:sz w:val="20"/>
-                <w:szCs w:val="24"/>
-              </w:rPr>
-            </w:pPr>
-            <w:r>
-              <w:rPr>
-                <w:rFonts w:ascii="Times New Roman" w:hAnsi="Times New Roman" w:cs="Times New Roman"/>
-                <w:sz w:val="20"/>
-                <w:szCs w:val="24"/>
-              </w:rPr>
-              <w:t xml:space="preserve">Дата подписания: </w:t>
-            </w:r>
-            <w:proofErr w:type="gramStart"/>
-            <w:r>
-              <w:rPr>
-                <w:rFonts w:ascii="Times New Roman" w:hAnsi="Times New Roman" w:cs="Times New Roman"/>
-                <w:sz w:val="20"/>
-                <w:szCs w:val="24"/>
-              </w:rPr>
-              <w:t xml:space="preserve">{{ </w:t>
-            </w:r>
-            <w:r>
-              <w:rPr>
-                <w:rFonts w:ascii="Times New Roman" w:hAnsi="Times New Roman" w:cs="Times New Roman"/>
-                <w:sz w:val="20"/>
-                <w:szCs w:val="24"/>
-                <w:lang w:val="en-US"/>
-              </w:rPr>
               <w:t>review</w:t>
             </w:r>
-            <w:proofErr w:type="gramEnd"/>
             <w:r>
               <w:rPr>
                 <w:rFonts w:ascii="Times New Roman" w:hAnsi="Times New Roman" w:cs="Times New Roman"/>
@@ -1160,17 +1026,19 @@
                 <w:rFonts w:ascii="Times New Roman" w:hAnsi="Times New Roman" w:cs="Times New Roman"/>
                 <w:sz w:val="20"/>
                 <w:szCs w:val="24"/>
-              </w:rPr>
-            </w:pPr>
-            <w:proofErr w:type="gramStart"/>
+                <w:lang w:val="en-US"/>
+              </w:rPr>
+            </w:pPr>
             <w:r>
               <w:rPr>
                 <w:rFonts w:ascii="Times New Roman" w:hAnsi="Times New Roman" w:cs="Times New Roman"/>
                 <w:sz w:val="20"/>
                 <w:szCs w:val="24"/>
+                <w:lang w:val="en-US"/>
               </w:rPr>
               <w:t xml:space="preserve">{{ </w:t>
             </w:r>
+            <w:proofErr w:type="spellStart"/>
             <w:r>
               <w:rPr>
                 <w:rFonts w:ascii="Times New Roman" w:hAnsi="Times New Roman" w:cs="Times New Roman"/>
@@ -1180,16 +1048,15 @@
               </w:rPr>
               <w:t>user</w:t>
             </w:r>
-            <w:proofErr w:type="gramEnd"/>
             <w:r>
               <w:rPr>
                 <w:rFonts w:ascii="Times New Roman" w:hAnsi="Times New Roman" w:cs="Times New Roman"/>
                 <w:sz w:val="20"/>
                 <w:szCs w:val="24"/>
+                <w:lang w:val="en-US"/>
               </w:rPr>
               <w:t>_</w:t>
             </w:r>
-            <w:proofErr w:type="gramStart"/>
             <w:r>
               <w:rPr>
                 <w:rFonts w:ascii="Times New Roman" w:hAnsi="Times New Roman" w:cs="Times New Roman"/>
@@ -1199,31 +1066,34 @@
               </w:rPr>
               <w:t>type</w:t>
             </w:r>
+            <w:proofErr w:type="spellEnd"/>
             <w:r>
               <w:rPr>
                 <w:rFonts w:ascii="Times New Roman" w:hAnsi="Times New Roman" w:cs="Times New Roman"/>
                 <w:sz w:val="20"/>
                 <w:szCs w:val="24"/>
-              </w:rPr>
-              <w:t xml:space="preserve"> }</w:t>
-            </w:r>
-            <w:proofErr w:type="gramEnd"/>
+                <w:lang w:val="en-US"/>
+              </w:rPr>
+              <w:t xml:space="preserve"> }}: </w:t>
+            </w:r>
             <w:r>
               <w:rPr>
                 <w:rFonts w:ascii="Times New Roman" w:hAnsi="Times New Roman" w:cs="Times New Roman"/>
                 <w:sz w:val="20"/>
                 <w:szCs w:val="24"/>
-              </w:rPr>
-              <w:t xml:space="preserve">}: </w:t>
-            </w:r>
-            <w:proofErr w:type="gramStart"/>
+                <w:lang w:val="en-US"/>
+              </w:rPr>
+              <w:t xml:space="preserve">{{ </w:t>
+            </w:r>
+            <w:proofErr w:type="spellStart"/>
             <w:r>
               <w:rPr>
                 <w:rFonts w:ascii="Times New Roman" w:hAnsi="Times New Roman" w:cs="Times New Roman"/>
                 <w:sz w:val="20"/>
                 <w:szCs w:val="24"/>
-              </w:rPr>
-              <w:t xml:space="preserve">{{ </w:t>
+                <w:lang w:val="en-US"/>
+              </w:rPr>
+              <w:t>user</w:t>
             </w:r>
             <w:r>
               <w:rPr>
@@ -1232,18 +1102,18 @@
                 <w:szCs w:val="24"/>
                 <w:lang w:val="en-US"/>
               </w:rPr>
-              <w:t>user</w:t>
-            </w:r>
-            <w:proofErr w:type="gramEnd"/>
+              <w:t>_</w:t>
+            </w:r>
             <w:r>
               <w:rPr>
                 <w:rFonts w:ascii="Times New Roman" w:hAnsi="Times New Roman" w:cs="Times New Roman"/>
                 <w:sz w:val="20"/>
                 <w:szCs w:val="24"/>
-              </w:rPr>
-              <w:t>_</w:t>
-            </w:r>
-            <w:proofErr w:type="gramStart"/>
+                <w:lang w:val="en-US"/>
+              </w:rPr>
+              <w:t>accepted</w:t>
+            </w:r>
+            <w:proofErr w:type="spellEnd"/>
             <w:r>
               <w:rPr>
                 <w:rFonts w:ascii="Times New Roman" w:hAnsi="Times New Roman" w:cs="Times New Roman"/>
@@ -1251,42 +1121,42 @@
                 <w:szCs w:val="24"/>
                 <w:lang w:val="en-US"/>
               </w:rPr>
-              <w:t>accepted</w:t>
-            </w:r>
-            <w:r>
+              <w:t xml:space="preserve"> }}</w:t>
+            </w:r>
+          </w:p>
+          <w:p>
+            <w:pPr>
               <w:rPr>
                 <w:rFonts w:ascii="Times New Roman" w:hAnsi="Times New Roman" w:cs="Times New Roman"/>
                 <w:sz w:val="20"/>
                 <w:szCs w:val="24"/>
-              </w:rPr>
-              <w:t xml:space="preserve"> }</w:t>
-            </w:r>
-            <w:proofErr w:type="gramEnd"/>
+                <w:lang w:val="en-US"/>
+              </w:rPr>
+            </w:pPr>
             <w:r>
               <w:rPr>
                 <w:rFonts w:ascii="Times New Roman" w:hAnsi="Times New Roman" w:cs="Times New Roman"/>
                 <w:sz w:val="20"/>
                 <w:szCs w:val="24"/>
               </w:rPr>
-              <w:t>}</w:t>
-            </w:r>
-          </w:p>
-          <w:p>
-            <w:pPr>
+              <w:t>Дата</w:t>
+            </w:r>
+            <w:r>
               <w:rPr>
                 <w:rFonts w:ascii="Times New Roman" w:hAnsi="Times New Roman" w:cs="Times New Roman"/>
                 <w:sz w:val="20"/>
                 <w:szCs w:val="24"/>
                 <w:lang w:val="en-US"/>
               </w:rPr>
-            </w:pPr>
+              <w:t xml:space="preserve"> </w:t>
+            </w:r>
             <w:r>
               <w:rPr>
                 <w:rFonts w:ascii="Times New Roman" w:hAnsi="Times New Roman" w:cs="Times New Roman"/>
                 <w:sz w:val="20"/>
                 <w:szCs w:val="24"/>
               </w:rPr>
-              <w:t>Дата</w:t>
+              <w:t>подписания</w:t>
             </w:r>
             <w:r>
               <w:rPr>
@@ -1295,16 +1165,18 @@
                 <w:szCs w:val="24"/>
                 <w:lang w:val="en-US"/>
               </w:rPr>
-              <w:t xml:space="preserve"> </w:t>
+              <w:t>:</w:t>
             </w:r>
             <w:r>
               <w:rPr>
                 <w:rFonts w:ascii="Times New Roman" w:hAnsi="Times New Roman" w:cs="Times New Roman"/>
                 <w:sz w:val="20"/>
                 <w:szCs w:val="24"/>
-              </w:rPr>
-              <w:t>подписания</w:t>
-            </w:r>
+                <w:lang w:val="en-US"/>
+              </w:rPr>
+              <w:t xml:space="preserve"> {{ </w:t>
+            </w:r>
+            <w:proofErr w:type="spellStart"/>
             <w:r>
               <w:rPr>
                 <w:rFonts w:ascii="Times New Roman" w:hAnsi="Times New Roman" w:cs="Times New Roman"/>
@@ -1312,46 +1184,7 @@
                 <w:szCs w:val="24"/>
                 <w:lang w:val="en-US"/>
               </w:rPr>
-              <w:t>:</w:t>
-            </w:r>
-            <w:r>
-              <w:rPr>
-                <w:rFonts w:ascii="Times New Roman" w:hAnsi="Times New Roman" w:cs="Times New Roman"/>
-                <w:sz w:val="20"/>
-                <w:szCs w:val="24"/>
-                <w:lang w:val="en-US"/>
-              </w:rPr>
-              <w:t xml:space="preserve"> </w:t>
-            </w:r>
-            <w:proofErr w:type="gramStart"/>
-            <w:r>
-              <w:rPr>
-                <w:rFonts w:ascii="Times New Roman" w:hAnsi="Times New Roman" w:cs="Times New Roman"/>
-                <w:sz w:val="20"/>
-                <w:szCs w:val="24"/>
-                <w:lang w:val="en-US"/>
-              </w:rPr>
-              <w:t xml:space="preserve">{{ </w:t>
-            </w:r>
-            <w:proofErr w:type="spellStart"/>
-            <w:r>
-              <w:rPr>
-                <w:rFonts w:ascii="Times New Roman" w:hAnsi="Times New Roman" w:cs="Times New Roman"/>
-                <w:sz w:val="20"/>
-                <w:szCs w:val="24"/>
-                <w:lang w:val="en-US"/>
-              </w:rPr>
-              <w:t>accept</w:t>
-            </w:r>
-            <w:proofErr w:type="gramEnd"/>
-            <w:r>
-              <w:rPr>
-                <w:rFonts w:ascii="Times New Roman" w:hAnsi="Times New Roman" w:cs="Times New Roman"/>
-                <w:sz w:val="20"/>
-                <w:szCs w:val="24"/>
-                <w:lang w:val="en-US"/>
-              </w:rPr>
-              <w:t>_date</w:t>
+              <w:t>accept_date</w:t>
             </w:r>
             <w:proofErr w:type="spellEnd"/>
             <w:r>
@@ -1523,7 +1356,7 @@
           <w:sz w:val="24"/>
           <w:szCs w:val="24"/>
         </w:rPr>
-        <w:t xml:space="preserve">» обеспечивает формирование следующих компетенций </w:t>
+        <w:t xml:space="preserve">» обеспечивает формирование следующих </w:t>
       </w:r>
       <w:r>
         <w:rPr>
@@ -1704,7 +1537,6 @@
               <w:t>{{</w:t>
             </w:r>
             <w:proofErr w:type="spellStart"/>
-            <w:proofErr w:type="gramStart"/>
             <w:r>
               <w:rPr>
                 <w:rFonts w:ascii="Times New Roman" w:hAnsi="Times New Roman" w:cs="Times New Roman"/>
@@ -1724,7 +1556,6 @@
               <w:t>index</w:t>
             </w:r>
             <w:proofErr w:type="spellEnd"/>
-            <w:proofErr w:type="gramEnd"/>
             <w:r>
               <w:rPr>
                 <w:rFonts w:ascii="Times New Roman" w:hAnsi="Times New Roman" w:cs="Times New Roman"/>
@@ -1735,7 +1566,6 @@
               <w:t>}} {{</w:t>
             </w:r>
             <w:proofErr w:type="spellStart"/>
-            <w:proofErr w:type="gramStart"/>
             <w:r>
               <w:rPr>
                 <w:rFonts w:ascii="Times New Roman" w:hAnsi="Times New Roman" w:cs="Times New Roman"/>
@@ -1755,7 +1585,6 @@
               <w:t>content</w:t>
             </w:r>
             <w:proofErr w:type="spellEnd"/>
-            <w:proofErr w:type="gramEnd"/>
             <w:r>
               <w:rPr>
                 <w:rFonts w:ascii="Times New Roman" w:hAnsi="Times New Roman" w:cs="Times New Roman"/>
@@ -1787,7 +1616,6 @@
                 <w:lang w:val="en-US"/>
               </w:rPr>
             </w:pPr>
-            <w:proofErr w:type="gramStart"/>
             <w:r>
               <w:rPr>
                 <w:rFonts w:ascii="Times New Roman" w:hAnsi="Times New Roman" w:cs="Times New Roman"/>
@@ -1805,17 +1633,7 @@
                 <w:szCs w:val="24"/>
                 <w:lang w:val="en-US"/>
               </w:rPr>
-              <w:t>item</w:t>
-            </w:r>
-            <w:proofErr w:type="gramEnd"/>
-            <w:r>
-              <w:rPr>
-                <w:rFonts w:ascii="Times New Roman" w:hAnsi="Times New Roman" w:cs="Times New Roman"/>
-                <w:sz w:val="24"/>
-                <w:szCs w:val="24"/>
-                <w:lang w:val="en-US"/>
-              </w:rPr>
-              <w:t>.</w:t>
+              <w:t>item.</w:t>
             </w:r>
             <w:r>
               <w:rPr>
@@ -2101,7 +1919,6 @@
               <w:t>{{</w:t>
             </w:r>
             <w:proofErr w:type="spellStart"/>
-            <w:proofErr w:type="gramStart"/>
             <w:r>
               <w:rPr>
                 <w:rFonts w:ascii="Times New Roman" w:hAnsi="Times New Roman" w:cs="Times New Roman"/>
@@ -2114,7 +1931,6 @@
               <w:t>item.index</w:t>
             </w:r>
             <w:proofErr w:type="spellEnd"/>
-            <w:proofErr w:type="gramEnd"/>
             <w:r>
               <w:rPr>
                 <w:rFonts w:ascii="Times New Roman" w:hAnsi="Times New Roman" w:cs="Times New Roman"/>
@@ -2171,7 +1987,6 @@
               <w:t>{{</w:t>
             </w:r>
             <w:proofErr w:type="spellStart"/>
-            <w:proofErr w:type="gramStart"/>
             <w:r>
               <w:rPr>
                 <w:rFonts w:ascii="Times New Roman" w:hAnsi="Times New Roman" w:cs="Times New Roman"/>
@@ -2184,7 +1999,6 @@
               <w:t>item.content</w:t>
             </w:r>
             <w:proofErr w:type="spellEnd"/>
-            <w:proofErr w:type="gramEnd"/>
             <w:r>
               <w:rPr>
                 <w:rFonts w:ascii="Times New Roman" w:hAnsi="Times New Roman" w:cs="Times New Roman"/>
@@ -2243,7 +2057,6 @@
               <w:t xml:space="preserve"> {{</w:t>
             </w:r>
             <w:proofErr w:type="spellStart"/>
-            <w:proofErr w:type="gramStart"/>
             <w:r>
               <w:rPr>
                 <w:rFonts w:ascii="Times New Roman" w:hAnsi="Times New Roman" w:cs="Times New Roman"/>
@@ -2256,7 +2069,6 @@
               <w:t>item.know</w:t>
             </w:r>
             <w:proofErr w:type="spellEnd"/>
-            <w:proofErr w:type="gramEnd"/>
             <w:r>
               <w:rPr>
                 <w:rFonts w:ascii="Times New Roman" w:hAnsi="Times New Roman" w:cs="Times New Roman"/>
@@ -2315,7 +2127,6 @@
               <w:t>{{</w:t>
             </w:r>
             <w:proofErr w:type="spellStart"/>
-            <w:proofErr w:type="gramStart"/>
             <w:r>
               <w:rPr>
                 <w:rFonts w:ascii="Times New Roman" w:hAnsi="Times New Roman" w:cs="Times New Roman"/>
@@ -2328,7 +2139,6 @@
               <w:t>item.able</w:t>
             </w:r>
             <w:proofErr w:type="spellEnd"/>
-            <w:proofErr w:type="gramEnd"/>
             <w:r>
               <w:rPr>
                 <w:rFonts w:ascii="Times New Roman" w:hAnsi="Times New Roman" w:cs="Times New Roman"/>
@@ -2542,7 +2352,6 @@
         </w:rPr>
         <w:t xml:space="preserve"> </w:t>
       </w:r>
-      <w:proofErr w:type="gramStart"/>
       <w:r>
         <w:rPr>
           <w:rFonts w:ascii="Times New Roman" w:hAnsi="Times New Roman" w:cs="Times New Roman"/>
@@ -2568,7 +2377,6 @@
         </w:rPr>
         <w:t>sum</w:t>
       </w:r>
-      <w:proofErr w:type="gramEnd"/>
       <w:r>
         <w:rPr>
           <w:rFonts w:ascii="Times New Roman" w:hAnsi="Times New Roman" w:cs="Times New Roman"/>
@@ -2724,7 +2532,6 @@
               </w:rPr>
               <w:t xml:space="preserve"> </w:t>
             </w:r>
-            <w:proofErr w:type="gramStart"/>
             <w:r>
               <w:rPr>
                 <w:rFonts w:ascii="Times New Roman" w:hAnsi="Times New Roman" w:cs="Times New Roman"/>
@@ -2741,18 +2548,7 @@
                 <w:sz w:val="24"/>
                 <w:szCs w:val="24"/>
               </w:rPr>
-              <w:t>Трудоемкость</w:t>
-            </w:r>
-            <w:proofErr w:type="gramEnd"/>
-            <w:r>
-              <w:rPr>
-                <w:rFonts w:ascii="Times New Roman" w:hAnsi="Times New Roman" w:cs="Times New Roman"/>
-                <w:b/>
-                <w:bCs/>
-                <w:sz w:val="24"/>
-                <w:szCs w:val="24"/>
-              </w:rPr>
-              <w:t xml:space="preserve"> в академических часах</w:t>
+              <w:t>Трудоемкость в академических часах</w:t>
             </w:r>
           </w:p>
           <w:p>
@@ -3709,7 +3505,6 @@
                 <w:lang w:val="en-US"/>
               </w:rPr>
             </w:pPr>
-            <w:proofErr w:type="gramStart"/>
             <w:r>
               <w:rPr>
                 <w:rFonts w:ascii="Times New Roman" w:hAnsi="Times New Roman" w:cs="Times New Roman"/>
@@ -3748,17 +3543,7 @@
                 <w:szCs w:val="24"/>
                 <w:lang w:val="en-US"/>
               </w:rPr>
-              <w:t>aud</w:t>
-            </w:r>
-            <w:proofErr w:type="gramEnd"/>
-            <w:r>
-              <w:rPr>
-                <w:rFonts w:ascii="Times New Roman" w:hAnsi="Times New Roman" w:cs="Times New Roman"/>
-                <w:sz w:val="24"/>
-                <w:szCs w:val="24"/>
-                <w:lang w:val="en-US"/>
-              </w:rPr>
-              <w:t>_</w:t>
+              <w:t>aud_</w:t>
             </w:r>
             <w:r>
               <w:rPr>
@@ -4015,7 +3800,6 @@
                 <w:szCs w:val="24"/>
               </w:rPr>
             </w:pPr>
-            <w:proofErr w:type="gramStart"/>
             <w:r>
               <w:rPr>
                 <w:rFonts w:ascii="Times New Roman" w:hAnsi="Times New Roman" w:cs="Times New Roman"/>
@@ -4033,7 +3817,6 @@
               </w:rPr>
               <w:t>sha</w:t>
             </w:r>
-            <w:proofErr w:type="gramEnd"/>
             <w:r>
               <w:rPr>
                 <w:rFonts w:ascii="Times New Roman" w:hAnsi="Times New Roman" w:cs="Times New Roman"/>
@@ -4239,7 +4022,6 @@
               </w:rPr>
               <w:t>{{</w:t>
             </w:r>
-            <w:proofErr w:type="gramStart"/>
             <w:r>
               <w:rPr>
                 <w:rFonts w:ascii="Times New Roman" w:hAnsi="Times New Roman" w:cs="Times New Roman"/>
@@ -4268,7 +4050,6 @@
               <w:t>lekc</w:t>
             </w:r>
             <w:proofErr w:type="spellEnd"/>
-            <w:proofErr w:type="gramEnd"/>
             <w:r>
               <w:rPr>
                 <w:rFonts w:ascii="Times New Roman" w:hAnsi="Times New Roman" w:cs="Times New Roman"/>
@@ -4432,7 +4213,6 @@
                 <w:szCs w:val="24"/>
               </w:rPr>
             </w:pPr>
-            <w:proofErr w:type="gramStart"/>
             <w:r>
               <w:rPr>
                 <w:rFonts w:ascii="Times New Roman" w:hAnsi="Times New Roman" w:cs="Times New Roman"/>
@@ -4467,7 +4247,6 @@
               </w:rPr>
               <w:t>lab</w:t>
             </w:r>
-            <w:proofErr w:type="gramEnd"/>
             <w:r>
               <w:rPr>
                 <w:rFonts w:ascii="Times New Roman" w:hAnsi="Times New Roman" w:cs="Times New Roman"/>
@@ -4812,7 +4591,6 @@
                 <w:lang w:val="en-US"/>
               </w:rPr>
             </w:pPr>
-            <w:proofErr w:type="gramStart"/>
             <w:r>
               <w:rPr>
                 <w:rFonts w:ascii="Times New Roman" w:hAnsi="Times New Roman" w:cs="Times New Roman"/>
@@ -4839,17 +4617,7 @@
                 <w:szCs w:val="24"/>
                 <w:lang w:val="en-US"/>
               </w:rPr>
-              <w:t>.pr</w:t>
-            </w:r>
-            <w:proofErr w:type="gramEnd"/>
-            <w:r>
-              <w:rPr>
-                <w:rFonts w:ascii="Times New Roman" w:hAnsi="Times New Roman" w:cs="Times New Roman"/>
-                <w:sz w:val="24"/>
-                <w:szCs w:val="24"/>
-                <w:lang w:val="en-US"/>
-              </w:rPr>
-              <w:t>_hours_all</w:t>
+              <w:t>.pr_hours_all</w:t>
             </w:r>
             <w:proofErr w:type="spellEnd"/>
             <w:r>
@@ -5091,25 +4859,14 @@
                 <w:lang w:val="en-US"/>
               </w:rPr>
             </w:pPr>
-            <w:proofErr w:type="gramStart"/>
-            <w:r>
-              <w:rPr>
-                <w:rFonts w:ascii="Times New Roman" w:hAnsi="Times New Roman" w:cs="Times New Roman"/>
-                <w:sz w:val="24"/>
-                <w:szCs w:val="24"/>
-                <w:lang w:val="en-US"/>
-              </w:rPr>
-              <w:t>{{ sha</w:t>
-            </w:r>
-            <w:proofErr w:type="gramEnd"/>
-            <w:r>
-              <w:rPr>
-                <w:rFonts w:ascii="Times New Roman" w:hAnsi="Times New Roman" w:cs="Times New Roman"/>
-                <w:sz w:val="24"/>
-                <w:szCs w:val="24"/>
-                <w:lang w:val="en-US"/>
-              </w:rPr>
-              <w:t>.</w:t>
+            <w:r>
+              <w:rPr>
+                <w:rFonts w:ascii="Times New Roman" w:hAnsi="Times New Roman" w:cs="Times New Roman"/>
+                <w:sz w:val="24"/>
+                <w:szCs w:val="24"/>
+                <w:lang w:val="en-US"/>
+              </w:rPr>
+              <w:t>{{ sha.</w:t>
             </w:r>
             <w:r>
               <w:t xml:space="preserve"> </w:t>
@@ -5224,17 +4981,7 @@
                 <w:szCs w:val="24"/>
                 <w:lang w:val="en-US"/>
               </w:rPr>
-              <w:t>{{</w:t>
-            </w:r>
-            <w:proofErr w:type="gramStart"/>
-            <w:r>
-              <w:rPr>
-                <w:rFonts w:ascii="Times New Roman" w:hAnsi="Times New Roman" w:cs="Times New Roman"/>
-                <w:sz w:val="24"/>
-                <w:szCs w:val="24"/>
-                <w:lang w:val="en-US"/>
-              </w:rPr>
-              <w:t>item.</w:t>
+              <w:t>{{item.</w:t>
             </w:r>
             <w:r>
               <w:t>c</w:t>
@@ -5249,7 +4996,6 @@
               </w:rPr>
               <w:t>ontact</w:t>
             </w:r>
-            <w:proofErr w:type="gramEnd"/>
             <w:r>
               <w:rPr>
                 <w:rFonts w:ascii="Times New Roman" w:hAnsi="Times New Roman" w:cs="Times New Roman"/>
@@ -5558,7 +5304,6 @@
               </w:rPr>
               <w:t>{{</w:t>
             </w:r>
-            <w:proofErr w:type="gramStart"/>
             <w:r>
               <w:rPr>
                 <w:rFonts w:ascii="Times New Roman" w:hAnsi="Times New Roman" w:cs="Times New Roman"/>
@@ -5587,7 +5332,6 @@
               <w:t>eios</w:t>
             </w:r>
             <w:proofErr w:type="spellEnd"/>
-            <w:proofErr w:type="gramEnd"/>
             <w:r>
               <w:rPr>
                 <w:rFonts w:ascii="Times New Roman" w:hAnsi="Times New Roman" w:cs="Times New Roman"/>
@@ -5720,7 +5464,6 @@
                 <w:lang w:val="en-US"/>
               </w:rPr>
             </w:pPr>
-            <w:proofErr w:type="gramStart"/>
             <w:r>
               <w:rPr>
                 <w:rFonts w:ascii="Times New Roman" w:hAnsi="Times New Roman" w:cs="Times New Roman"/>
@@ -5747,17 +5490,7 @@
                 <w:szCs w:val="24"/>
                 <w:lang w:val="en-US"/>
               </w:rPr>
-              <w:t>.srs</w:t>
-            </w:r>
-            <w:proofErr w:type="gramEnd"/>
-            <w:r>
-              <w:rPr>
-                <w:rFonts w:ascii="Times New Roman" w:hAnsi="Times New Roman" w:cs="Times New Roman"/>
-                <w:sz w:val="24"/>
-                <w:szCs w:val="24"/>
-                <w:lang w:val="en-US"/>
-              </w:rPr>
-              <w:t>_hours_all</w:t>
+              <w:t>.srs_hours_all</w:t>
             </w:r>
             <w:proofErr w:type="spellEnd"/>
             <w:r>
@@ -5999,7 +5732,6 @@
                 <w:lang w:val="en-US"/>
               </w:rPr>
             </w:pPr>
-            <w:proofErr w:type="gramStart"/>
             <w:r>
               <w:rPr>
                 <w:rFonts w:ascii="Times New Roman" w:hAnsi="Times New Roman" w:cs="Times New Roman"/>
@@ -6017,17 +5749,7 @@
                 <w:szCs w:val="24"/>
                 <w:lang w:val="en-US"/>
               </w:rPr>
-              <w:t>sha.ekz</w:t>
-            </w:r>
-            <w:proofErr w:type="gramEnd"/>
-            <w:r>
-              <w:rPr>
-                <w:rFonts w:ascii="Times New Roman" w:hAnsi="Times New Roman" w:cs="Times New Roman"/>
-                <w:sz w:val="24"/>
-                <w:szCs w:val="24"/>
-                <w:lang w:val="en-US"/>
-              </w:rPr>
-              <w:t>_hours_all</w:t>
+              <w:t>sha.ekz_hours_all</w:t>
             </w:r>
             <w:proofErr w:type="spellEnd"/>
             <w:r>
@@ -6260,7 +5982,6 @@
                 <w:lang w:val="en-US"/>
               </w:rPr>
             </w:pPr>
-            <w:proofErr w:type="gramStart"/>
             <w:r>
               <w:rPr>
                 <w:rFonts w:ascii="Times New Roman" w:hAnsi="Times New Roman" w:cs="Times New Roman"/>
@@ -6287,17 +6008,7 @@
                 <w:szCs w:val="24"/>
                 <w:lang w:val="en-US"/>
               </w:rPr>
-              <w:t>.tic</w:t>
-            </w:r>
-            <w:proofErr w:type="gramEnd"/>
-            <w:r>
-              <w:rPr>
-                <w:rFonts w:ascii="Times New Roman" w:hAnsi="Times New Roman" w:cs="Times New Roman"/>
-                <w:sz w:val="24"/>
-                <w:szCs w:val="24"/>
-                <w:lang w:val="en-US"/>
-              </w:rPr>
-              <w:t>_all</w:t>
+              <w:t>.tic_all</w:t>
             </w:r>
             <w:proofErr w:type="spellEnd"/>
             <w:r>
@@ -6700,7 +6411,6 @@
         <w:t xml:space="preserve"> </w:t>
       </w:r>
       <w:proofErr w:type="spellStart"/>
-      <w:proofErr w:type="gramStart"/>
       <w:r>
         <w:rPr>
           <w:rFonts w:ascii="Times New Roman" w:hAnsi="Times New Roman" w:cs="Times New Roman"/>
@@ -6735,7 +6445,6 @@
         <w:t>items</w:t>
       </w:r>
       <w:proofErr w:type="spellEnd"/>
-      <w:proofErr w:type="gramEnd"/>
       <w:r>
         <w:rPr>
           <w:rFonts w:ascii="Times New Roman" w:hAnsi="Times New Roman" w:cs="Times New Roman"/>
@@ -6815,7 +6524,6 @@
         </w:rPr>
         <w:t xml:space="preserve"> № </w:t>
       </w:r>
-      <w:proofErr w:type="gramStart"/>
       <w:r>
         <w:rPr>
           <w:rFonts w:ascii="Times New Roman" w:hAnsi="Times New Roman" w:cs="Times New Roman"/>
@@ -6840,7 +6548,6 @@
         </w:rPr>
         <w:t xml:space="preserve"> key</w:t>
       </w:r>
-      <w:proofErr w:type="gramEnd"/>
       <w:r>
         <w:rPr>
           <w:rFonts w:ascii="Times New Roman" w:hAnsi="Times New Roman" w:cs="Times New Roman"/>
@@ -7769,7 +7476,6 @@
                 <w:szCs w:val="20"/>
               </w:rPr>
             </w:pPr>
-            <w:proofErr w:type="gramStart"/>
             <w:r>
               <w:rPr>
                 <w:rFonts w:ascii="Times New Roman" w:hAnsi="Times New Roman" w:cs="Times New Roman"/>
@@ -7799,7 +7505,6 @@
               <w:t>.num</w:t>
             </w:r>
             <w:proofErr w:type="spellEnd"/>
-            <w:proofErr w:type="gramEnd"/>
             <w:r>
               <w:rPr>
                 <w:rFonts w:ascii="Times New Roman" w:hAnsi="Times New Roman" w:cs="Times New Roman"/>
@@ -7824,7 +7529,6 @@
                 <w:lang w:val="en-US"/>
               </w:rPr>
             </w:pPr>
-            <w:proofErr w:type="gramStart"/>
             <w:r>
               <w:rPr>
                 <w:rFonts w:ascii="Times New Roman" w:hAnsi="Times New Roman" w:cs="Times New Roman"/>
@@ -7832,17 +7536,7 @@
                 <w:szCs w:val="20"/>
                 <w:lang w:val="en-US"/>
               </w:rPr>
-              <w:t>{{ i</w:t>
-            </w:r>
-            <w:proofErr w:type="gramEnd"/>
-            <w:r>
-              <w:rPr>
-                <w:rFonts w:ascii="Times New Roman" w:hAnsi="Times New Roman" w:cs="Times New Roman"/>
-                <w:sz w:val="20"/>
-                <w:szCs w:val="20"/>
-                <w:lang w:val="en-US"/>
-              </w:rPr>
-              <w:t>.name }}</w:t>
+              <w:t>{{ i.name }}</w:t>
             </w:r>
           </w:p>
         </w:tc>
@@ -7861,7 +7555,6 @@
                 <w:lang w:val="en-US"/>
               </w:rPr>
             </w:pPr>
-            <w:proofErr w:type="gramStart"/>
             <w:r>
               <w:rPr>
                 <w:rFonts w:ascii="Times New Roman" w:hAnsi="Times New Roman" w:cs="Times New Roman"/>
@@ -7879,17 +7572,7 @@
                 <w:szCs w:val="20"/>
                 <w:lang w:val="en-US"/>
               </w:rPr>
-              <w:t>i</w:t>
-            </w:r>
-            <w:proofErr w:type="gramEnd"/>
-            <w:r>
-              <w:rPr>
-                <w:rFonts w:ascii="Times New Roman" w:hAnsi="Times New Roman" w:cs="Times New Roman"/>
-                <w:sz w:val="20"/>
-                <w:szCs w:val="20"/>
-                <w:lang w:val="en-US"/>
-              </w:rPr>
-              <w:t>.lekc</w:t>
+              <w:t>i.lekc</w:t>
             </w:r>
             <w:proofErr w:type="spellEnd"/>
             <w:r>
@@ -7918,7 +7601,6 @@
                 <w:lang w:val="en-US"/>
               </w:rPr>
             </w:pPr>
-            <w:proofErr w:type="gramStart"/>
             <w:r>
               <w:rPr>
                 <w:rFonts w:ascii="Times New Roman" w:hAnsi="Times New Roman" w:cs="Times New Roman"/>
@@ -7936,17 +7618,7 @@
                 <w:szCs w:val="20"/>
                 <w:lang w:val="en-US"/>
               </w:rPr>
-              <w:t>i</w:t>
-            </w:r>
-            <w:proofErr w:type="gramEnd"/>
-            <w:r>
-              <w:rPr>
-                <w:rFonts w:ascii="Times New Roman" w:hAnsi="Times New Roman" w:cs="Times New Roman"/>
-                <w:sz w:val="20"/>
-                <w:szCs w:val="20"/>
-                <w:lang w:val="en-US"/>
-              </w:rPr>
-              <w:t>.lekc_hours</w:t>
+              <w:t>i.lekc_hours</w:t>
             </w:r>
             <w:proofErr w:type="spellEnd"/>
             <w:r>
@@ -7975,7 +7647,6 @@
                 <w:lang w:val="en-US"/>
               </w:rPr>
             </w:pPr>
-            <w:proofErr w:type="gramStart"/>
             <w:r>
               <w:rPr>
                 <w:rFonts w:ascii="Times New Roman" w:hAnsi="Times New Roman" w:cs="Times New Roman"/>
@@ -7996,7 +7667,6 @@
               <w:t>i.lab</w:t>
             </w:r>
             <w:proofErr w:type="spellEnd"/>
-            <w:proofErr w:type="gramEnd"/>
             <w:r>
               <w:rPr>
                 <w:rFonts w:ascii="Times New Roman" w:hAnsi="Times New Roman" w:cs="Times New Roman"/>
@@ -8023,7 +7693,6 @@
                 <w:lang w:val="en-US"/>
               </w:rPr>
             </w:pPr>
-            <w:proofErr w:type="gramStart"/>
             <w:r>
               <w:rPr>
                 <w:rFonts w:ascii="Times New Roman" w:hAnsi="Times New Roman" w:cs="Times New Roman"/>
@@ -8041,17 +7710,7 @@
                 <w:szCs w:val="20"/>
                 <w:lang w:val="en-US"/>
               </w:rPr>
-              <w:t>i.lab</w:t>
-            </w:r>
-            <w:proofErr w:type="gramEnd"/>
-            <w:r>
-              <w:rPr>
-                <w:rFonts w:ascii="Times New Roman" w:hAnsi="Times New Roman" w:cs="Times New Roman"/>
-                <w:sz w:val="20"/>
-                <w:szCs w:val="20"/>
-                <w:lang w:val="en-US"/>
-              </w:rPr>
-              <w:t>_hours</w:t>
+              <w:t>i.lab_hours</w:t>
             </w:r>
             <w:proofErr w:type="spellEnd"/>
             <w:r>
@@ -8080,7 +7739,6 @@
                 <w:lang w:val="en-US"/>
               </w:rPr>
             </w:pPr>
-            <w:proofErr w:type="gramStart"/>
             <w:r>
               <w:rPr>
                 <w:rFonts w:ascii="Times New Roman" w:hAnsi="Times New Roman" w:cs="Times New Roman"/>
@@ -8088,17 +7746,7 @@
                 <w:szCs w:val="20"/>
                 <w:lang w:val="en-US"/>
               </w:rPr>
-              <w:t>{{ i</w:t>
-            </w:r>
-            <w:proofErr w:type="gramEnd"/>
-            <w:r>
-              <w:rPr>
-                <w:rFonts w:ascii="Times New Roman" w:hAnsi="Times New Roman" w:cs="Times New Roman"/>
-                <w:sz w:val="20"/>
-                <w:szCs w:val="20"/>
-                <w:lang w:val="en-US"/>
-              </w:rPr>
-              <w:t>.pr }}</w:t>
+              <w:t>{{ i.pr }}</w:t>
             </w:r>
           </w:p>
         </w:tc>
@@ -8117,7 +7765,6 @@
                 <w:lang w:val="en-US"/>
               </w:rPr>
             </w:pPr>
-            <w:proofErr w:type="gramStart"/>
             <w:r>
               <w:rPr>
                 <w:rFonts w:ascii="Times New Roman" w:hAnsi="Times New Roman" w:cs="Times New Roman"/>
@@ -8135,17 +7782,7 @@
                 <w:szCs w:val="20"/>
                 <w:lang w:val="en-US"/>
               </w:rPr>
-              <w:t>i</w:t>
-            </w:r>
-            <w:proofErr w:type="gramEnd"/>
-            <w:r>
-              <w:rPr>
-                <w:rFonts w:ascii="Times New Roman" w:hAnsi="Times New Roman" w:cs="Times New Roman"/>
-                <w:sz w:val="20"/>
-                <w:szCs w:val="20"/>
-                <w:lang w:val="en-US"/>
-              </w:rPr>
-              <w:t>.pr_hours</w:t>
+              <w:t>i.pr_hours</w:t>
             </w:r>
             <w:proofErr w:type="spellEnd"/>
             <w:r>
@@ -8174,7 +7811,6 @@
                 <w:lang w:val="en-US"/>
               </w:rPr>
             </w:pPr>
-            <w:proofErr w:type="gramStart"/>
             <w:r>
               <w:rPr>
                 <w:rFonts w:ascii="Times New Roman" w:hAnsi="Times New Roman" w:cs="Times New Roman"/>
@@ -8195,7 +7831,6 @@
               <w:t>i.srs</w:t>
             </w:r>
             <w:proofErr w:type="spellEnd"/>
-            <w:proofErr w:type="gramEnd"/>
             <w:r>
               <w:rPr>
                 <w:rFonts w:ascii="Times New Roman" w:hAnsi="Times New Roman" w:cs="Times New Roman"/>
@@ -8222,7 +7857,6 @@
                 <w:lang w:val="en-US"/>
               </w:rPr>
             </w:pPr>
-            <w:proofErr w:type="gramStart"/>
             <w:r>
               <w:rPr>
                 <w:rFonts w:ascii="Times New Roman" w:hAnsi="Times New Roman" w:cs="Times New Roman"/>
@@ -8240,17 +7874,7 @@
                 <w:szCs w:val="20"/>
                 <w:lang w:val="en-US"/>
               </w:rPr>
-              <w:t>i.srs</w:t>
-            </w:r>
-            <w:proofErr w:type="gramEnd"/>
-            <w:r>
-              <w:rPr>
-                <w:rFonts w:ascii="Times New Roman" w:hAnsi="Times New Roman" w:cs="Times New Roman"/>
-                <w:sz w:val="20"/>
-                <w:szCs w:val="20"/>
-                <w:lang w:val="en-US"/>
-              </w:rPr>
-              <w:t>_hours</w:t>
+              <w:t>i.srs_hours</w:t>
             </w:r>
             <w:proofErr w:type="spellEnd"/>
             <w:r>
@@ -8279,7 +7903,6 @@
                 <w:lang w:val="en-US"/>
               </w:rPr>
             </w:pPr>
-            <w:proofErr w:type="gramStart"/>
             <w:r>
               <w:rPr>
                 <w:rFonts w:ascii="Times New Roman" w:hAnsi="Times New Roman" w:cs="Times New Roman"/>
@@ -8309,7 +7932,6 @@
               <w:t>tic</w:t>
             </w:r>
             <w:proofErr w:type="spellEnd"/>
-            <w:proofErr w:type="gramEnd"/>
             <w:r>
               <w:rPr>
                 <w:rFonts w:ascii="Times New Roman" w:hAnsi="Times New Roman" w:cs="Times New Roman"/>
@@ -8656,7 +8278,6 @@
         <w:t xml:space="preserve"> in </w:t>
       </w:r>
       <w:proofErr w:type="spellStart"/>
-      <w:proofErr w:type="gramStart"/>
       <w:r>
         <w:rPr>
           <w:rFonts w:ascii="Times New Roman" w:hAnsi="Times New Roman" w:cs="Times New Roman"/>
@@ -8669,7 +8290,6 @@
         <w:t>dg.items</w:t>
       </w:r>
       <w:proofErr w:type="spellEnd"/>
-      <w:proofErr w:type="gramEnd"/>
       <w:r>
         <w:rPr>
           <w:rFonts w:ascii="Times New Roman" w:hAnsi="Times New Roman" w:cs="Times New Roman"/>
@@ -8738,7 +8358,6 @@
         </w:rPr>
         <w:t xml:space="preserve"> № </w:t>
       </w:r>
-      <w:proofErr w:type="gramStart"/>
       <w:r>
         <w:rPr>
           <w:rFonts w:ascii="Times New Roman" w:hAnsi="Times New Roman" w:cs="Times New Roman"/>
@@ -8749,20 +8368,7 @@
           <w:u w:val="single"/>
           <w:lang w:val="en-US"/>
         </w:rPr>
-        <w:t>{{ key</w:t>
-      </w:r>
-      <w:proofErr w:type="gramEnd"/>
-      <w:r>
-        <w:rPr>
-          <w:rFonts w:ascii="Times New Roman" w:hAnsi="Times New Roman" w:cs="Times New Roman"/>
-          <w:b/>
-          <w:bCs/>
-          <w:sz w:val="24"/>
-          <w:szCs w:val="24"/>
-          <w:u w:val="single"/>
-          <w:lang w:val="en-US"/>
-        </w:rPr>
-        <w:t xml:space="preserve"> }}</w:t>
+        <w:t>{{ key }}</w:t>
       </w:r>
     </w:p>
     <w:tbl>
@@ -8915,7 +8521,6 @@
                 <w:lang w:val="en-US"/>
               </w:rPr>
             </w:pPr>
-            <w:proofErr w:type="gramStart"/>
             <w:r>
               <w:rPr>
                 <w:rFonts w:ascii="Times New Roman" w:hAnsi="Times New Roman" w:cs="Times New Roman"/>
@@ -8954,7 +8559,6 @@
               <w:t>.num</w:t>
             </w:r>
             <w:proofErr w:type="spellEnd"/>
-            <w:proofErr w:type="gramEnd"/>
             <w:r>
               <w:rPr>
                 <w:rFonts w:ascii="Times New Roman" w:hAnsi="Times New Roman" w:cs="Times New Roman"/>
@@ -8979,7 +8583,6 @@
                 <w:lang w:val="en-US"/>
               </w:rPr>
             </w:pPr>
-            <w:proofErr w:type="gramStart"/>
             <w:r>
               <w:rPr>
                 <w:rFonts w:ascii="Times New Roman" w:hAnsi="Times New Roman" w:cs="Times New Roman"/>
@@ -8998,7 +8601,6 @@
               </w:rPr>
               <w:t xml:space="preserve"> i</w:t>
             </w:r>
-            <w:proofErr w:type="gramEnd"/>
             <w:r>
               <w:rPr>
                 <w:rFonts w:ascii="Times New Roman" w:hAnsi="Times New Roman" w:cs="Times New Roman"/>
@@ -9023,7 +8625,6 @@
                 <w:lang w:val="en-US"/>
               </w:rPr>
             </w:pPr>
-            <w:proofErr w:type="gramStart"/>
             <w:r>
               <w:rPr>
                 <w:rFonts w:ascii="Times New Roman" w:hAnsi="Times New Roman" w:cs="Times New Roman"/>
@@ -9043,7 +8644,6 @@
               </w:rPr>
               <w:t>i</w:t>
             </w:r>
-            <w:proofErr w:type="gramEnd"/>
             <w:r>
               <w:rPr>
                 <w:rFonts w:ascii="Times New Roman" w:hAnsi="Times New Roman" w:cs="Times New Roman"/>
@@ -9534,7 +9134,6 @@
         <w:t xml:space="preserve"> </w:t>
       </w:r>
       <w:proofErr w:type="spellStart"/>
-      <w:proofErr w:type="gramStart"/>
       <w:r>
         <w:rPr>
           <w:rFonts w:ascii="Times New Roman" w:hAnsi="Times New Roman" w:cs="Times New Roman"/>
@@ -9569,7 +9168,6 @@
         <w:t>items</w:t>
       </w:r>
       <w:proofErr w:type="spellEnd"/>
-      <w:proofErr w:type="gramEnd"/>
       <w:r>
         <w:rPr>
           <w:rFonts w:ascii="Times New Roman" w:hAnsi="Times New Roman" w:cs="Times New Roman"/>
@@ -9636,7 +9234,6 @@
         </w:rPr>
         <w:t xml:space="preserve"> № </w:t>
       </w:r>
-      <w:proofErr w:type="gramStart"/>
       <w:r>
         <w:rPr>
           <w:rFonts w:ascii="Times New Roman" w:hAnsi="Times New Roman" w:cs="Times New Roman"/>
@@ -9647,20 +9244,7 @@
           <w:u w:val="single"/>
           <w:lang w:val="en-US"/>
         </w:rPr>
-        <w:t>{{ key</w:t>
-      </w:r>
-      <w:proofErr w:type="gramEnd"/>
-      <w:r>
-        <w:rPr>
-          <w:rFonts w:ascii="Times New Roman" w:hAnsi="Times New Roman" w:cs="Times New Roman"/>
-          <w:b/>
-          <w:bCs/>
-          <w:sz w:val="24"/>
-          <w:szCs w:val="24"/>
-          <w:u w:val="single"/>
-          <w:lang w:val="en-US"/>
-        </w:rPr>
-        <w:t xml:space="preserve"> }}</w:t>
+        <w:t>{{ key }}</w:t>
       </w:r>
     </w:p>
     <w:tbl>
@@ -9898,7 +9482,6 @@
                 <w:szCs w:val="24"/>
               </w:rPr>
             </w:pPr>
-            <w:proofErr w:type="gramStart"/>
             <w:r>
               <w:rPr>
                 <w:rFonts w:ascii="Times New Roman" w:hAnsi="Times New Roman" w:cs="Times New Roman"/>
@@ -9918,7 +9501,6 @@
               <w:t>i</w:t>
             </w:r>
             <w:proofErr w:type="spellEnd"/>
-            <w:proofErr w:type="gramEnd"/>
             <w:r>
               <w:rPr>
                 <w:rFonts w:ascii="Times New Roman" w:hAnsi="Times New Roman" w:cs="Times New Roman"/>
@@ -9958,7 +9540,6 @@
                 <w:szCs w:val="24"/>
               </w:rPr>
             </w:pPr>
-            <w:proofErr w:type="gramStart"/>
             <w:r>
               <w:rPr>
                 <w:rFonts w:ascii="Times New Roman" w:hAnsi="Times New Roman" w:cs="Times New Roman"/>
@@ -9978,7 +9559,6 @@
               <w:t>i</w:t>
             </w:r>
             <w:proofErr w:type="spellEnd"/>
-            <w:proofErr w:type="gramEnd"/>
             <w:r>
               <w:rPr>
                 <w:rFonts w:ascii="Times New Roman" w:hAnsi="Times New Roman" w:cs="Times New Roman"/>
@@ -10020,7 +9600,6 @@
                 <w:szCs w:val="24"/>
               </w:rPr>
             </w:pPr>
-            <w:proofErr w:type="gramStart"/>
             <w:r>
               <w:rPr>
                 <w:rFonts w:ascii="Times New Roman" w:hAnsi="Times New Roman" w:cs="Times New Roman"/>
@@ -10040,7 +9619,6 @@
               <w:t>i</w:t>
             </w:r>
             <w:proofErr w:type="spellEnd"/>
-            <w:proofErr w:type="gramEnd"/>
             <w:r>
               <w:rPr>
                 <w:rFonts w:ascii="Times New Roman" w:hAnsi="Times New Roman" w:cs="Times New Roman"/>
@@ -10538,7 +10116,6 @@
         <w:t xml:space="preserve"> </w:t>
       </w:r>
       <w:proofErr w:type="spellStart"/>
-      <w:proofErr w:type="gramStart"/>
       <w:r>
         <w:rPr>
           <w:rFonts w:ascii="Times New Roman" w:hAnsi="Times New Roman" w:cs="Times New Roman"/>
@@ -10573,7 +10150,6 @@
         <w:t>items</w:t>
       </w:r>
       <w:proofErr w:type="spellEnd"/>
-      <w:proofErr w:type="gramEnd"/>
       <w:r>
         <w:rPr>
           <w:rFonts w:ascii="Times New Roman" w:hAnsi="Times New Roman" w:cs="Times New Roman"/>
@@ -10641,7 +10217,6 @@
         </w:rPr>
         <w:t xml:space="preserve"> № </w:t>
       </w:r>
-      <w:proofErr w:type="gramStart"/>
       <w:r>
         <w:rPr>
           <w:rFonts w:ascii="Times New Roman" w:hAnsi="Times New Roman" w:cs="Times New Roman"/>
@@ -10652,20 +10227,7 @@
           <w:u w:val="single"/>
           <w:lang w:val="en-US"/>
         </w:rPr>
-        <w:t>{{ key</w:t>
-      </w:r>
-      <w:proofErr w:type="gramEnd"/>
-      <w:r>
-        <w:rPr>
-          <w:rFonts w:ascii="Times New Roman" w:hAnsi="Times New Roman" w:cs="Times New Roman"/>
-          <w:b/>
-          <w:bCs/>
-          <w:sz w:val="24"/>
-          <w:szCs w:val="24"/>
-          <w:u w:val="single"/>
-          <w:lang w:val="en-US"/>
-        </w:rPr>
-        <w:t xml:space="preserve"> }}</w:t>
+        <w:t>{{ key }}</w:t>
       </w:r>
     </w:p>
     <w:tbl>
@@ -10894,7 +10456,6 @@
                 <w:szCs w:val="24"/>
               </w:rPr>
             </w:pPr>
-            <w:proofErr w:type="gramStart"/>
             <w:r>
               <w:rPr>
                 <w:rFonts w:ascii="Times New Roman" w:hAnsi="Times New Roman" w:cs="Times New Roman"/>
@@ -10915,7 +10476,6 @@
               <w:t>i</w:t>
             </w:r>
             <w:proofErr w:type="spellEnd"/>
-            <w:proofErr w:type="gramEnd"/>
             <w:r>
               <w:rPr>
                 <w:rFonts w:ascii="Times New Roman" w:hAnsi="Times New Roman" w:cs="Times New Roman"/>
@@ -10955,7 +10515,6 @@
                 <w:szCs w:val="24"/>
               </w:rPr>
             </w:pPr>
-            <w:proofErr w:type="gramStart"/>
             <w:r>
               <w:rPr>
                 <w:rFonts w:ascii="Times New Roman" w:hAnsi="Times New Roman" w:cs="Times New Roman"/>
@@ -10975,7 +10534,6 @@
               <w:t>i</w:t>
             </w:r>
             <w:proofErr w:type="spellEnd"/>
-            <w:proofErr w:type="gramEnd"/>
             <w:r>
               <w:rPr>
                 <w:rFonts w:ascii="Times New Roman" w:hAnsi="Times New Roman" w:cs="Times New Roman"/>
@@ -11017,7 +10575,6 @@
                 <w:szCs w:val="24"/>
               </w:rPr>
             </w:pPr>
-            <w:proofErr w:type="gramStart"/>
             <w:r>
               <w:rPr>
                 <w:rFonts w:ascii="Times New Roman" w:hAnsi="Times New Roman" w:cs="Times New Roman"/>
@@ -11037,7 +10594,6 @@
               <w:t>i</w:t>
             </w:r>
             <w:proofErr w:type="spellEnd"/>
-            <w:proofErr w:type="gramEnd"/>
             <w:r>
               <w:rPr>
                 <w:rFonts w:ascii="Times New Roman" w:hAnsi="Times New Roman" w:cs="Times New Roman"/>
@@ -11539,7 +11095,6 @@
         <w:t xml:space="preserve"> </w:t>
       </w:r>
       <w:proofErr w:type="spellStart"/>
-      <w:proofErr w:type="gramStart"/>
       <w:r>
         <w:rPr>
           <w:rFonts w:ascii="Times New Roman" w:hAnsi="Times New Roman" w:cs="Times New Roman"/>
@@ -11574,7 +11129,6 @@
         <w:t>items</w:t>
       </w:r>
       <w:proofErr w:type="spellEnd"/>
-      <w:proofErr w:type="gramEnd"/>
       <w:r>
         <w:rPr>
           <w:rFonts w:ascii="Times New Roman" w:hAnsi="Times New Roman" w:cs="Times New Roman"/>
@@ -11641,7 +11195,6 @@
         </w:rPr>
         <w:t xml:space="preserve"> № </w:t>
       </w:r>
-      <w:proofErr w:type="gramStart"/>
       <w:r>
         <w:rPr>
           <w:rFonts w:ascii="Times New Roman" w:hAnsi="Times New Roman" w:cs="Times New Roman"/>
@@ -11652,20 +11205,7 @@
           <w:u w:val="single"/>
           <w:lang w:val="en-US"/>
         </w:rPr>
-        <w:t>{{ key</w:t>
-      </w:r>
-      <w:proofErr w:type="gramEnd"/>
-      <w:r>
-        <w:rPr>
-          <w:rFonts w:ascii="Times New Roman" w:hAnsi="Times New Roman" w:cs="Times New Roman"/>
-          <w:b/>
-          <w:bCs/>
-          <w:sz w:val="24"/>
-          <w:szCs w:val="24"/>
-          <w:u w:val="single"/>
-          <w:lang w:val="en-US"/>
-        </w:rPr>
-        <w:t xml:space="preserve"> }}</w:t>
+        <w:t>{{ key }}</w:t>
       </w:r>
     </w:p>
     <w:tbl>
@@ -11894,7 +11434,6 @@
                 <w:szCs w:val="24"/>
               </w:rPr>
             </w:pPr>
-            <w:proofErr w:type="gramStart"/>
             <w:r>
               <w:rPr>
                 <w:rFonts w:ascii="Times New Roman" w:hAnsi="Times New Roman" w:cs="Times New Roman"/>
@@ -11914,7 +11453,6 @@
               <w:t>i</w:t>
             </w:r>
             <w:proofErr w:type="spellEnd"/>
-            <w:proofErr w:type="gramEnd"/>
             <w:r>
               <w:rPr>
                 <w:rFonts w:ascii="Times New Roman" w:hAnsi="Times New Roman" w:cs="Times New Roman"/>
@@ -11954,7 +11492,6 @@
                 <w:szCs w:val="24"/>
               </w:rPr>
             </w:pPr>
-            <w:proofErr w:type="gramStart"/>
             <w:r>
               <w:rPr>
                 <w:rFonts w:ascii="Times New Roman" w:hAnsi="Times New Roman" w:cs="Times New Roman"/>
@@ -11974,7 +11511,6 @@
               <w:t>i</w:t>
             </w:r>
             <w:proofErr w:type="spellEnd"/>
-            <w:proofErr w:type="gramEnd"/>
             <w:r>
               <w:rPr>
                 <w:rFonts w:ascii="Times New Roman" w:hAnsi="Times New Roman" w:cs="Times New Roman"/>
@@ -12016,7 +11552,6 @@
                 <w:szCs w:val="24"/>
               </w:rPr>
             </w:pPr>
-            <w:proofErr w:type="gramStart"/>
             <w:r>
               <w:rPr>
                 <w:rFonts w:ascii="Times New Roman" w:hAnsi="Times New Roman" w:cs="Times New Roman"/>
@@ -12036,7 +11571,6 @@
               <w:t>i</w:t>
             </w:r>
             <w:proofErr w:type="spellEnd"/>
-            <w:proofErr w:type="gramEnd"/>
             <w:r>
               <w:rPr>
                 <w:rFonts w:ascii="Times New Roman" w:hAnsi="Times New Roman" w:cs="Times New Roman"/>
@@ -12212,16 +11746,7 @@
           <w:sz w:val="24"/>
           <w:szCs w:val="24"/>
         </w:rPr>
-        <w:t xml:space="preserve"> используются следующие интерактивные методы обучения: </w:t>
-      </w:r>
-      <w:proofErr w:type="gramStart"/>
-      <w:r>
-        <w:rPr>
-          <w:rFonts w:ascii="Times New Roman" w:hAnsi="Times New Roman" w:cs="Times New Roman"/>
-          <w:sz w:val="24"/>
-          <w:szCs w:val="24"/>
-        </w:rPr>
-        <w:t xml:space="preserve">{{ </w:t>
+        <w:t xml:space="preserve"> используются следующие интерактивные методы обучения: {{ </w:t>
       </w:r>
       <w:proofErr w:type="spellStart"/>
       <w:r>
@@ -12230,25 +11755,7 @@
           <w:sz w:val="24"/>
           <w:szCs w:val="24"/>
         </w:rPr>
-        <w:t>interactive</w:t>
-      </w:r>
-      <w:proofErr w:type="gramEnd"/>
-      <w:r>
-        <w:rPr>
-          <w:rFonts w:ascii="Times New Roman" w:hAnsi="Times New Roman" w:cs="Times New Roman"/>
-          <w:sz w:val="24"/>
-          <w:szCs w:val="24"/>
-        </w:rPr>
-        <w:t>_</w:t>
-      </w:r>
-      <w:proofErr w:type="gramStart"/>
-      <w:r>
-        <w:rPr>
-          <w:rFonts w:ascii="Times New Roman" w:hAnsi="Times New Roman" w:cs="Times New Roman"/>
-          <w:sz w:val="24"/>
-          <w:szCs w:val="24"/>
-        </w:rPr>
-        <w:t>methods</w:t>
+        <w:t>interactive_methods</w:t>
       </w:r>
       <w:proofErr w:type="spellEnd"/>
       <w:r>
@@ -12257,16 +11764,7 @@
           <w:sz w:val="24"/>
           <w:szCs w:val="24"/>
         </w:rPr>
-        <w:t xml:space="preserve"> }</w:t>
-      </w:r>
-      <w:proofErr w:type="gramEnd"/>
-      <w:r>
-        <w:rPr>
-          <w:rFonts w:ascii="Times New Roman" w:hAnsi="Times New Roman" w:cs="Times New Roman"/>
-          <w:sz w:val="24"/>
-          <w:szCs w:val="24"/>
-        </w:rPr>
-        <w:t>}</w:t>
+        <w:t xml:space="preserve"> }}</w:t>
       </w:r>
     </w:p>
     <w:p>
@@ -12459,19 +11957,7 @@
           <w:szCs w:val="24"/>
           <w:lang w:val="en-US"/>
         </w:rPr>
-        <w:t>.</w:t>
-      </w:r>
-      <w:proofErr w:type="gramStart"/>
-      <w:r>
-        <w:rPr>
-          <w:rFonts w:ascii="Times New Roman" w:hAnsi="Times New Roman" w:cs="Times New Roman"/>
-          <w:b/>
-          <w:bCs/>
-          <w:sz w:val="24"/>
-          <w:szCs w:val="24"/>
-          <w:lang w:val="en-US"/>
-        </w:rPr>
-        <w:t>1.</w:t>
+        <w:t>.1.</w:t>
       </w:r>
       <w:r>
         <w:rPr>
@@ -12495,14 +11981,7 @@
         <w:rPr>
           <w:lang w:val="en-US"/>
         </w:rPr>
-        <w:t>i</w:t>
-      </w:r>
-      <w:proofErr w:type="gramEnd"/>
-      <w:r>
-        <w:rPr>
-          <w:lang w:val="en-US"/>
-        </w:rPr>
-        <w:t>.</w:t>
+        <w:t>i.</w:t>
       </w:r>
       <w:r>
         <w:rPr>
@@ -12528,7 +12007,6 @@
         <w:t>}} {{</w:t>
       </w:r>
       <w:proofErr w:type="spellStart"/>
-      <w:proofErr w:type="gramStart"/>
       <w:r>
         <w:rPr>
           <w:rFonts w:ascii="Times New Roman" w:hAnsi="Times New Roman" w:cs="Times New Roman"/>
@@ -12552,7 +12030,6 @@
         <w:t>title</w:t>
       </w:r>
       <w:proofErr w:type="spellEnd"/>
-      <w:proofErr w:type="gramEnd"/>
       <w:r>
         <w:rPr>
           <w:rFonts w:ascii="Times New Roman" w:hAnsi="Times New Roman" w:cs="Times New Roman"/>
@@ -12572,6 +12049,7 @@
           <w:rFonts w:ascii="Times New Roman" w:hAnsi="Times New Roman" w:cs="Times New Roman"/>
           <w:sz w:val="24"/>
           <w:szCs w:val="24"/>
+          <w:lang w:val="en-US"/>
         </w:rPr>
       </w:pPr>
       <w:r>
@@ -12579,11 +12057,11 @@
           <w:rFonts w:ascii="Times New Roman" w:hAnsi="Times New Roman" w:cs="Times New Roman"/>
           <w:sz w:val="24"/>
           <w:szCs w:val="24"/>
+          <w:lang w:val="en-US"/>
         </w:rPr>
         <w:t>{{</w:t>
       </w:r>
       <w:proofErr w:type="spellStart"/>
-      <w:proofErr w:type="gramStart"/>
       <w:r>
         <w:rPr>
           <w:rFonts w:ascii="Times New Roman" w:hAnsi="Times New Roman" w:cs="Times New Roman"/>
@@ -12593,30 +12071,31 @@
         </w:rPr>
         <w:t>i</w:t>
       </w:r>
+      <w:r>
+        <w:rPr>
+          <w:rFonts w:ascii="Times New Roman" w:hAnsi="Times New Roman" w:cs="Times New Roman"/>
+          <w:sz w:val="24"/>
+          <w:szCs w:val="24"/>
+          <w:lang w:val="en-US"/>
+        </w:rPr>
+        <w:t>.</w:t>
+      </w:r>
+      <w:r>
+        <w:rPr>
+          <w:rFonts w:ascii="Times New Roman" w:hAnsi="Times New Roman" w:cs="Times New Roman"/>
+          <w:sz w:val="24"/>
+          <w:szCs w:val="24"/>
+          <w:lang w:val="en-US"/>
+        </w:rPr>
+        <w:t>content</w:t>
+      </w:r>
       <w:proofErr w:type="spellEnd"/>
       <w:r>
         <w:rPr>
           <w:rFonts w:ascii="Times New Roman" w:hAnsi="Times New Roman" w:cs="Times New Roman"/>
           <w:sz w:val="24"/>
           <w:szCs w:val="24"/>
-        </w:rPr>
-        <w:t>.</w:t>
-      </w:r>
-      <w:r>
-        <w:rPr>
-          <w:rFonts w:ascii="Times New Roman" w:hAnsi="Times New Roman" w:cs="Times New Roman"/>
-          <w:sz w:val="24"/>
-          <w:szCs w:val="24"/>
-          <w:lang w:val="en-US"/>
-        </w:rPr>
-        <w:t>content</w:t>
-      </w:r>
-      <w:proofErr w:type="gramEnd"/>
-      <w:r>
-        <w:rPr>
-          <w:rFonts w:ascii="Times New Roman" w:hAnsi="Times New Roman" w:cs="Times New Roman"/>
-          <w:sz w:val="24"/>
-          <w:szCs w:val="24"/>
+          <w:lang w:val="en-US"/>
         </w:rPr>
         <w:t>}}</w:t>
       </w:r>
@@ -12782,7 +12261,6 @@
           <w:bCs/>
           <w:sz w:val="24"/>
           <w:szCs w:val="24"/>
-          <w:lang w:val="en-US"/>
         </w:rPr>
       </w:pPr>
       <w:r>
@@ -12792,7 +12270,6 @@
           <w:bCs/>
           <w:sz w:val="24"/>
           <w:szCs w:val="24"/>
-          <w:lang w:val="en-US"/>
         </w:rPr>
         <w:t>{%</w:t>
       </w:r>
@@ -12803,7 +12280,6 @@
           <w:bCs/>
           <w:sz w:val="24"/>
           <w:szCs w:val="24"/>
-          <w:lang w:val="en-US"/>
         </w:rPr>
         <w:t>-</w:t>
       </w:r>
@@ -12814,7 +12290,6 @@
           <w:bCs/>
           <w:sz w:val="24"/>
           <w:szCs w:val="24"/>
-          <w:lang w:val="en-US"/>
         </w:rPr>
         <w:t xml:space="preserve"> </w:t>
       </w:r>
@@ -12836,7 +12311,6 @@
           <w:bCs/>
           <w:sz w:val="24"/>
           <w:szCs w:val="24"/>
-          <w:lang w:val="en-US"/>
         </w:rPr>
         <w:t xml:space="preserve"> </w:t>
       </w:r>
@@ -12860,7 +12334,6 @@
           <w:bCs/>
           <w:sz w:val="24"/>
           <w:szCs w:val="24"/>
-          <w:lang w:val="en-US"/>
         </w:rPr>
         <w:t xml:space="preserve"> </w:t>
       </w:r>
@@ -12882,7 +12355,6 @@
           <w:bCs/>
           <w:sz w:val="24"/>
           <w:szCs w:val="24"/>
-          <w:lang w:val="en-US"/>
         </w:rPr>
         <w:t xml:space="preserve"> </w:t>
       </w:r>
@@ -12906,7 +12378,6 @@
           <w:bCs/>
           <w:sz w:val="24"/>
           <w:szCs w:val="24"/>
-          <w:lang w:val="en-US"/>
         </w:rPr>
         <w:t xml:space="preserve"> </w:t>
       </w:r>
@@ -12917,7 +12388,6 @@
           <w:bCs/>
           <w:sz w:val="24"/>
           <w:szCs w:val="24"/>
-          <w:lang w:val="en-US"/>
         </w:rPr>
         <w:t>%}</w:t>
       </w:r>
@@ -12932,7 +12402,6 @@
           <w:bCs/>
           <w:sz w:val="24"/>
           <w:szCs w:val="24"/>
-          <w:lang w:val="en-US"/>
         </w:rPr>
       </w:pPr>
       <w:r>
@@ -12942,7 +12411,6 @@
           <w:bCs/>
           <w:sz w:val="24"/>
           <w:szCs w:val="24"/>
-          <w:lang w:val="en-US"/>
         </w:rPr>
         <w:t>5</w:t>
       </w:r>
@@ -12953,39 +12421,64 @@
           <w:bCs/>
           <w:sz w:val="24"/>
           <w:szCs w:val="24"/>
-          <w:lang w:val="en-US"/>
-        </w:rPr>
+        </w:rPr>
+        <w:t>.1.{{</w:t>
+      </w:r>
+      <w:r>
+        <w:t xml:space="preserve"> </w:t>
+      </w:r>
+      <w:proofErr w:type="spellStart"/>
+      <w:r>
+        <w:rPr>
+          <w:lang w:val="en-US"/>
+        </w:rPr>
+        <w:t>i</w:t>
+      </w:r>
+      <w:proofErr w:type="spellEnd"/>
+      <w:r>
         <w:t>.</w:t>
       </w:r>
-      <w:proofErr w:type="gramStart"/>
-      <w:r>
-        <w:rPr>
-          <w:rFonts w:ascii="Times New Roman" w:hAnsi="Times New Roman" w:cs="Times New Roman"/>
-          <w:b/>
-          <w:bCs/>
-          <w:sz w:val="24"/>
-          <w:szCs w:val="24"/>
-          <w:lang w:val="en-US"/>
-        </w:rPr>
-        <w:t>1.{{</w:t>
-      </w:r>
-      <w:r>
-        <w:rPr>
-          <w:lang w:val="en-US"/>
-        </w:rPr>
-        <w:t xml:space="preserve"> </w:t>
+      <w:r>
+        <w:rPr>
+          <w:rFonts w:ascii="Times New Roman" w:hAnsi="Times New Roman" w:cs="Times New Roman"/>
+          <w:b/>
+          <w:bCs/>
+          <w:sz w:val="24"/>
+          <w:szCs w:val="24"/>
+          <w:lang w:val="en-US"/>
+        </w:rPr>
+        <w:t>number</w:t>
+      </w:r>
+      <w:r>
+        <w:rPr>
+          <w:rFonts w:ascii="Times New Roman" w:hAnsi="Times New Roman" w:cs="Times New Roman"/>
+          <w:b/>
+          <w:bCs/>
+          <w:sz w:val="24"/>
+          <w:szCs w:val="24"/>
+        </w:rPr>
+        <w:t>}} {{</w:t>
       </w:r>
       <w:proofErr w:type="spellStart"/>
       <w:r>
         <w:rPr>
+          <w:rFonts w:ascii="Times New Roman" w:hAnsi="Times New Roman" w:cs="Times New Roman"/>
+          <w:b/>
+          <w:bCs/>
+          <w:sz w:val="24"/>
+          <w:szCs w:val="24"/>
           <w:lang w:val="en-US"/>
         </w:rPr>
         <w:t>i</w:t>
       </w:r>
-      <w:proofErr w:type="gramEnd"/>
-      <w:r>
-        <w:rPr>
-          <w:lang w:val="en-US"/>
+      <w:proofErr w:type="spellEnd"/>
+      <w:r>
+        <w:rPr>
+          <w:rFonts w:ascii="Times New Roman" w:hAnsi="Times New Roman" w:cs="Times New Roman"/>
+          <w:b/>
+          <w:bCs/>
+          <w:sz w:val="24"/>
+          <w:szCs w:val="24"/>
         </w:rPr>
         <w:t>.</w:t>
       </w:r>
@@ -12998,65 +12491,15 @@
           <w:szCs w:val="24"/>
           <w:lang w:val="en-US"/>
         </w:rPr>
-        <w:t>number</w:t>
-      </w:r>
-      <w:proofErr w:type="spellEnd"/>
-      <w:r>
-        <w:rPr>
-          <w:rFonts w:ascii="Times New Roman" w:hAnsi="Times New Roman" w:cs="Times New Roman"/>
-          <w:b/>
-          <w:bCs/>
-          <w:sz w:val="24"/>
-          <w:szCs w:val="24"/>
-          <w:lang w:val="en-US"/>
-        </w:rPr>
-        <w:t>}} {{</w:t>
-      </w:r>
-      <w:proofErr w:type="spellStart"/>
-      <w:proofErr w:type="gramStart"/>
-      <w:r>
-        <w:rPr>
-          <w:rFonts w:ascii="Times New Roman" w:hAnsi="Times New Roman" w:cs="Times New Roman"/>
-          <w:b/>
-          <w:bCs/>
-          <w:sz w:val="24"/>
-          <w:szCs w:val="24"/>
-          <w:lang w:val="en-US"/>
-        </w:rPr>
-        <w:t>i</w:t>
-      </w:r>
-      <w:r>
-        <w:rPr>
-          <w:rFonts w:ascii="Times New Roman" w:hAnsi="Times New Roman" w:cs="Times New Roman"/>
-          <w:b/>
-          <w:bCs/>
-          <w:sz w:val="24"/>
-          <w:szCs w:val="24"/>
-          <w:lang w:val="en-US"/>
-        </w:rPr>
-        <w:t>.</w:t>
-      </w:r>
-      <w:r>
-        <w:rPr>
-          <w:rFonts w:ascii="Times New Roman" w:hAnsi="Times New Roman" w:cs="Times New Roman"/>
-          <w:b/>
-          <w:bCs/>
-          <w:sz w:val="24"/>
-          <w:szCs w:val="24"/>
-          <w:lang w:val="en-US"/>
-        </w:rPr>
         <w:t>title</w:t>
       </w:r>
-      <w:proofErr w:type="spellEnd"/>
-      <w:proofErr w:type="gramEnd"/>
-      <w:r>
-        <w:rPr>
-          <w:rFonts w:ascii="Times New Roman" w:hAnsi="Times New Roman" w:cs="Times New Roman"/>
-          <w:b/>
-          <w:bCs/>
-          <w:sz w:val="24"/>
-          <w:szCs w:val="24"/>
-          <w:lang w:val="en-US"/>
+      <w:r>
+        <w:rPr>
+          <w:rFonts w:ascii="Times New Roman" w:hAnsi="Times New Roman" w:cs="Times New Roman"/>
+          <w:b/>
+          <w:bCs/>
+          <w:sz w:val="24"/>
+          <w:szCs w:val="24"/>
         </w:rPr>
         <w:t>}}</w:t>
       </w:r>
@@ -13105,7 +12548,6 @@
         <w:t>{{</w:t>
       </w:r>
       <w:proofErr w:type="spellStart"/>
-      <w:proofErr w:type="gramStart"/>
       <w:r>
         <w:rPr>
           <w:rFonts w:ascii="Times New Roman" w:hAnsi="Times New Roman" w:cs="Times New Roman"/>
@@ -13133,7 +12575,6 @@
         </w:rPr>
         <w:t>about</w:t>
       </w:r>
-      <w:proofErr w:type="gramEnd"/>
       <w:r>
         <w:rPr>
           <w:rFonts w:ascii="Times New Roman" w:hAnsi="Times New Roman" w:cs="Times New Roman"/>
@@ -13185,7 +12626,6 @@
         <w:t>{{</w:t>
       </w:r>
       <w:proofErr w:type="spellStart"/>
-      <w:proofErr w:type="gramStart"/>
       <w:r>
         <w:rPr>
           <w:rFonts w:ascii="Times New Roman" w:hAnsi="Times New Roman" w:cs="Times New Roman"/>
@@ -13213,7 +12653,6 @@
         </w:rPr>
         <w:t>criteria</w:t>
       </w:r>
-      <w:proofErr w:type="gramEnd"/>
       <w:r>
         <w:rPr>
           <w:rFonts w:ascii="Times New Roman" w:hAnsi="Times New Roman" w:cs="Times New Roman"/>
@@ -13593,7 +13032,6 @@
                 <w:lang w:val="en-US"/>
               </w:rPr>
             </w:pPr>
-            <w:proofErr w:type="gramStart"/>
             <w:r>
               <w:rPr>
                 <w:rFonts w:ascii="Times New Roman" w:hAnsi="Times New Roman" w:cs="Times New Roman"/>
@@ -13613,18 +13051,7 @@
                 <w:szCs w:val="24"/>
                 <w:lang w:val="en-US"/>
               </w:rPr>
-              <w:t>i</w:t>
-            </w:r>
-            <w:proofErr w:type="gramEnd"/>
-            <w:r>
-              <w:rPr>
-                <w:rFonts w:ascii="Times New Roman" w:hAnsi="Times New Roman" w:cs="Times New Roman"/>
-                <w:bCs/>
-                <w:sz w:val="24"/>
-                <w:szCs w:val="24"/>
-                <w:lang w:val="en-US"/>
-              </w:rPr>
-              <w:t>.index</w:t>
+              <w:t>i.index</w:t>
             </w:r>
             <w:proofErr w:type="spellEnd"/>
             <w:r>
@@ -13665,7 +13092,6 @@
               <w:t>{{</w:t>
             </w:r>
             <w:proofErr w:type="spellStart"/>
-            <w:proofErr w:type="gramStart"/>
             <w:r>
               <w:rPr>
                 <w:rFonts w:ascii="Times New Roman" w:hAnsi="Times New Roman" w:cs="Times New Roman"/>
@@ -13677,7 +13103,6 @@
               <w:t>i.criteria</w:t>
             </w:r>
             <w:proofErr w:type="spellEnd"/>
-            <w:proofErr w:type="gramEnd"/>
             <w:r>
               <w:rPr>
                 <w:rFonts w:ascii="Times New Roman" w:hAnsi="Times New Roman" w:cs="Times New Roman"/>
@@ -13716,7 +13141,6 @@
               <w:t>{{</w:t>
             </w:r>
             <w:proofErr w:type="spellStart"/>
-            <w:proofErr w:type="gramStart"/>
             <w:r>
               <w:rPr>
                 <w:rFonts w:ascii="Times New Roman" w:hAnsi="Times New Roman" w:cs="Times New Roman"/>
@@ -13728,7 +13152,6 @@
               <w:t>i.methods</w:t>
             </w:r>
             <w:proofErr w:type="spellEnd"/>
-            <w:proofErr w:type="gramEnd"/>
             <w:r>
               <w:rPr>
                 <w:rFonts w:ascii="Times New Roman" w:hAnsi="Times New Roman" w:cs="Times New Roman"/>
@@ -14007,34 +13430,9 @@
           <w:szCs w:val="24"/>
           <w:lang w:val="en-US"/>
         </w:rPr>
-        <w:t>.2.</w:t>
-      </w:r>
-      <w:proofErr w:type="gramStart"/>
-      <w:r>
-        <w:rPr>
-          <w:rFonts w:ascii="Times New Roman" w:hAnsi="Times New Roman" w:cs="Times New Roman"/>
-          <w:b/>
-          <w:bCs/>
-          <w:sz w:val="24"/>
-          <w:szCs w:val="24"/>
-          <w:lang w:val="en-US"/>
-        </w:rPr>
-        <w:t>2.{</w:t>
-      </w:r>
-      <w:proofErr w:type="gramEnd"/>
-      <w:r>
-        <w:rPr>
-          <w:rFonts w:ascii="Times New Roman" w:hAnsi="Times New Roman" w:cs="Times New Roman"/>
-          <w:b/>
-          <w:bCs/>
-          <w:sz w:val="24"/>
-          <w:szCs w:val="24"/>
-          <w:lang w:val="en-US"/>
-        </w:rPr>
-        <w:t>{</w:t>
+        <w:t>.2.2.{{</w:t>
       </w:r>
       <w:proofErr w:type="spellStart"/>
-      <w:proofErr w:type="gramStart"/>
       <w:r>
         <w:rPr>
           <w:rFonts w:ascii="Times New Roman" w:hAnsi="Times New Roman" w:cs="Times New Roman"/>
@@ -14069,7 +13467,6 @@
         <w:t>number</w:t>
       </w:r>
       <w:proofErr w:type="spellEnd"/>
-      <w:proofErr w:type="gramEnd"/>
       <w:r>
         <w:rPr>
           <w:rFonts w:ascii="Times New Roman" w:hAnsi="Times New Roman" w:cs="Times New Roman"/>
@@ -14093,7 +13490,6 @@
         <w:t>{{</w:t>
       </w:r>
       <w:proofErr w:type="spellStart"/>
-      <w:proofErr w:type="gramStart"/>
       <w:r>
         <w:rPr>
           <w:rFonts w:ascii="Times New Roman" w:hAnsi="Times New Roman" w:cs="Times New Roman"/>
@@ -14106,7 +13502,6 @@
         <w:t>i.title</w:t>
       </w:r>
       <w:proofErr w:type="spellEnd"/>
-      <w:proofErr w:type="gramEnd"/>
       <w:r>
         <w:rPr>
           <w:rFonts w:ascii="Times New Roman" w:hAnsi="Times New Roman" w:cs="Times New Roman"/>
@@ -14150,34 +13545,9 @@
           <w:szCs w:val="24"/>
           <w:lang w:val="en-US"/>
         </w:rPr>
-        <w:t>.2.</w:t>
-      </w:r>
-      <w:proofErr w:type="gramStart"/>
-      <w:r>
-        <w:rPr>
-          <w:rFonts w:ascii="Times New Roman" w:hAnsi="Times New Roman" w:cs="Times New Roman"/>
-          <w:b/>
-          <w:bCs/>
-          <w:sz w:val="24"/>
-          <w:szCs w:val="24"/>
-          <w:lang w:val="en-US"/>
-        </w:rPr>
-        <w:t>2.{</w:t>
-      </w:r>
-      <w:proofErr w:type="gramEnd"/>
-      <w:r>
-        <w:rPr>
-          <w:rFonts w:ascii="Times New Roman" w:hAnsi="Times New Roman" w:cs="Times New Roman"/>
-          <w:b/>
-          <w:bCs/>
-          <w:sz w:val="24"/>
-          <w:szCs w:val="24"/>
-          <w:lang w:val="en-US"/>
-        </w:rPr>
-        <w:t>{</w:t>
+        <w:t>.2.2.{{</w:t>
       </w:r>
       <w:proofErr w:type="spellStart"/>
-      <w:proofErr w:type="gramStart"/>
       <w:r>
         <w:rPr>
           <w:rFonts w:ascii="Times New Roman" w:hAnsi="Times New Roman" w:cs="Times New Roman"/>
@@ -14212,7 +13582,6 @@
         <w:t>number</w:t>
       </w:r>
       <w:proofErr w:type="spellEnd"/>
-      <w:proofErr w:type="gramEnd"/>
       <w:r>
         <w:rPr>
           <w:rFonts w:ascii="Times New Roman" w:hAnsi="Times New Roman" w:cs="Times New Roman"/>
@@ -14289,7 +13658,6 @@
           <w:lang w:val="en-US"/>
         </w:rPr>
       </w:pPr>
-      <w:proofErr w:type="gramStart"/>
       <w:r>
         <w:rPr>
           <w:rFonts w:ascii="Times New Roman" w:hAnsi="Times New Roman" w:cs="Times New Roman"/>
@@ -14316,27 +13684,7 @@
           <w:szCs w:val="24"/>
           <w:lang w:val="en-US"/>
         </w:rPr>
-        <w:t>i</w:t>
-      </w:r>
-      <w:proofErr w:type="gramEnd"/>
-      <w:r>
-        <w:rPr>
-          <w:rFonts w:ascii="Times New Roman" w:hAnsi="Times New Roman" w:cs="Times New Roman"/>
-          <w:sz w:val="24"/>
-          <w:szCs w:val="24"/>
-          <w:lang w:val="en-US"/>
-        </w:rPr>
-        <w:t>.</w:t>
-      </w:r>
-      <w:proofErr w:type="gramStart"/>
-      <w:r>
-        <w:rPr>
-          <w:rFonts w:ascii="Times New Roman" w:hAnsi="Times New Roman" w:cs="Times New Roman"/>
-          <w:sz w:val="24"/>
-          <w:szCs w:val="24"/>
-          <w:lang w:val="en-US"/>
-        </w:rPr>
-        <w:t>about</w:t>
+        <w:t>i.about</w:t>
       </w:r>
       <w:proofErr w:type="spellEnd"/>
       <w:r>
@@ -14355,17 +13703,7 @@
           <w:szCs w:val="24"/>
           <w:lang w:val="en-US"/>
         </w:rPr>
-        <w:t>}</w:t>
-      </w:r>
-      <w:proofErr w:type="gramEnd"/>
-      <w:r>
-        <w:rPr>
-          <w:rFonts w:ascii="Times New Roman" w:hAnsi="Times New Roman" w:cs="Times New Roman"/>
-          <w:sz w:val="24"/>
-          <w:szCs w:val="24"/>
-          <w:lang w:val="en-US"/>
-        </w:rPr>
-        <w:t>}</w:t>
+        <w:t>}}</w:t>
       </w:r>
     </w:p>
     <w:p>
@@ -14443,7 +13781,6 @@
         </w:rPr>
         <w:t>.</w:t>
       </w:r>
-      <w:proofErr w:type="gramStart"/>
       <w:r>
         <w:rPr>
           <w:rFonts w:ascii="Times New Roman" w:hAnsi="Times New Roman" w:cs="Times New Roman"/>
@@ -14461,17 +13798,7 @@
           <w:szCs w:val="24"/>
           <w:lang w:val="en-US"/>
         </w:rPr>
-        <w:t xml:space="preserve"> !</w:t>
-      </w:r>
-      <w:proofErr w:type="gramEnd"/>
-      <w:r>
-        <w:rPr>
-          <w:rFonts w:ascii="Times New Roman" w:hAnsi="Times New Roman" w:cs="Times New Roman"/>
-          <w:sz w:val="24"/>
-          <w:szCs w:val="24"/>
-          <w:lang w:val="en-US"/>
-        </w:rPr>
-        <w:t>= ‘’ %}</w:t>
+        <w:t xml:space="preserve"> != ‘’ %}</w:t>
       </w:r>
     </w:p>
     <w:p>
@@ -14535,7 +13862,6 @@
           <w:lang w:val="en-US"/>
         </w:rPr>
       </w:pPr>
-      <w:proofErr w:type="gramStart"/>
       <w:r>
         <w:rPr>
           <w:rFonts w:ascii="Times New Roman" w:hAnsi="Times New Roman" w:cs="Times New Roman"/>
@@ -14555,7 +13881,6 @@
         </w:rPr>
         <w:t>i</w:t>
       </w:r>
-      <w:proofErr w:type="gramEnd"/>
       <w:r>
         <w:rPr>
           <w:rFonts w:ascii="Times New Roman" w:hAnsi="Times New Roman" w:cs="Times New Roman"/>
@@ -14565,7 +13890,6 @@
         </w:rPr>
         <w:t>.</w:t>
       </w:r>
-      <w:proofErr w:type="gramStart"/>
       <w:r>
         <w:rPr>
           <w:rFonts w:ascii="Times New Roman" w:hAnsi="Times New Roman" w:cs="Times New Roman"/>
@@ -14583,17 +13907,7 @@
           <w:szCs w:val="24"/>
           <w:lang w:val="en-US"/>
         </w:rPr>
-        <w:t xml:space="preserve"> }</w:t>
-      </w:r>
-      <w:proofErr w:type="gramEnd"/>
-      <w:r>
-        <w:rPr>
-          <w:rFonts w:ascii="Times New Roman" w:hAnsi="Times New Roman" w:cs="Times New Roman"/>
-          <w:sz w:val="24"/>
-          <w:szCs w:val="24"/>
-          <w:lang w:val="en-US"/>
-        </w:rPr>
-        <w:t>}</w:t>
+        <w:t xml:space="preserve"> }}</w:t>
       </w:r>
       <w:r>
         <w:rPr>
@@ -14704,34 +14018,9 @@
           <w:szCs w:val="24"/>
           <w:lang w:val="en-US"/>
         </w:rPr>
-        <w:t>.2.</w:t>
-      </w:r>
-      <w:proofErr w:type="gramStart"/>
-      <w:r>
-        <w:rPr>
-          <w:rFonts w:ascii="Times New Roman" w:hAnsi="Times New Roman" w:cs="Times New Roman"/>
-          <w:b/>
-          <w:bCs/>
-          <w:sz w:val="24"/>
-          <w:szCs w:val="24"/>
-          <w:lang w:val="en-US"/>
-        </w:rPr>
-        <w:t>2.{</w:t>
-      </w:r>
-      <w:proofErr w:type="gramEnd"/>
-      <w:r>
-        <w:rPr>
-          <w:rFonts w:ascii="Times New Roman" w:hAnsi="Times New Roman" w:cs="Times New Roman"/>
-          <w:b/>
-          <w:bCs/>
-          <w:sz w:val="24"/>
-          <w:szCs w:val="24"/>
-          <w:lang w:val="en-US"/>
-        </w:rPr>
-        <w:t>{</w:t>
+        <w:t>.2.2.{{</w:t>
       </w:r>
       <w:proofErr w:type="spellStart"/>
-      <w:proofErr w:type="gramStart"/>
       <w:r>
         <w:rPr>
           <w:rFonts w:ascii="Times New Roman" w:hAnsi="Times New Roman" w:cs="Times New Roman"/>
@@ -14766,7 +14055,6 @@
         <w:t>number</w:t>
       </w:r>
       <w:proofErr w:type="spellEnd"/>
-      <w:proofErr w:type="gramEnd"/>
       <w:r>
         <w:rPr>
           <w:rFonts w:ascii="Times New Roman" w:hAnsi="Times New Roman" w:cs="Times New Roman"/>
@@ -14874,7 +14162,6 @@
         <w:t xml:space="preserve"> </w:t>
       </w:r>
       <w:proofErr w:type="spellStart"/>
-      <w:proofErr w:type="gramStart"/>
       <w:r>
         <w:rPr>
           <w:rFonts w:ascii="Times New Roman" w:hAnsi="Times New Roman" w:cs="Times New Roman"/>
@@ -14906,7 +14193,6 @@
         <w:t>type</w:t>
       </w:r>
       <w:proofErr w:type="spellEnd"/>
-      <w:proofErr w:type="gramEnd"/>
       <w:r>
         <w:rPr>
           <w:rFonts w:ascii="Times New Roman" w:hAnsi="Times New Roman" w:cs="Times New Roman"/>
@@ -15047,7 +14333,6 @@
               <w:t>{{</w:t>
             </w:r>
             <w:proofErr w:type="spellStart"/>
-            <w:proofErr w:type="gramStart"/>
             <w:r>
               <w:rPr>
                 <w:rFonts w:ascii="Times New Roman" w:hAnsi="Times New Roman" w:cs="Times New Roman"/>
@@ -15058,7 +14343,6 @@
               <w:t>i.passed</w:t>
             </w:r>
             <w:proofErr w:type="spellEnd"/>
-            <w:proofErr w:type="gramEnd"/>
             <w:r>
               <w:rPr>
                 <w:rFonts w:ascii="Times New Roman" w:hAnsi="Times New Roman" w:cs="Times New Roman"/>
@@ -15095,7 +14379,6 @@
               <w:t>{{</w:t>
             </w:r>
             <w:proofErr w:type="spellStart"/>
-            <w:proofErr w:type="gramStart"/>
             <w:r>
               <w:rPr>
                 <w:rFonts w:ascii="Times New Roman" w:hAnsi="Times New Roman" w:cs="Times New Roman"/>
@@ -15106,7 +14389,6 @@
               <w:t>i.unpassed</w:t>
             </w:r>
             <w:proofErr w:type="spellEnd"/>
-            <w:proofErr w:type="gramEnd"/>
             <w:r>
               <w:rPr>
                 <w:rFonts w:ascii="Times New Roman" w:hAnsi="Times New Roman" w:cs="Times New Roman"/>
@@ -15285,7 +14567,6 @@
               <w:t>{{</w:t>
             </w:r>
             <w:proofErr w:type="spellStart"/>
-            <w:proofErr w:type="gramStart"/>
             <w:r>
               <w:rPr>
                 <w:rFonts w:ascii="Times New Roman" w:hAnsi="Times New Roman" w:cs="Times New Roman"/>
@@ -15296,7 +14577,6 @@
               <w:t>i.great</w:t>
             </w:r>
             <w:proofErr w:type="spellEnd"/>
-            <w:proofErr w:type="gramEnd"/>
             <w:r>
               <w:rPr>
                 <w:rFonts w:ascii="Times New Roman" w:hAnsi="Times New Roman" w:cs="Times New Roman"/>
@@ -15333,7 +14613,6 @@
               <w:t>{{</w:t>
             </w:r>
             <w:proofErr w:type="spellStart"/>
-            <w:proofErr w:type="gramStart"/>
             <w:r>
               <w:rPr>
                 <w:rFonts w:ascii="Times New Roman" w:hAnsi="Times New Roman" w:cs="Times New Roman"/>
@@ -15344,7 +14623,6 @@
               <w:t>i.good</w:t>
             </w:r>
             <w:proofErr w:type="spellEnd"/>
-            <w:proofErr w:type="gramEnd"/>
             <w:r>
               <w:rPr>
                 <w:rFonts w:ascii="Times New Roman" w:hAnsi="Times New Roman" w:cs="Times New Roman"/>
@@ -15381,7 +14659,6 @@
               <w:t>{{</w:t>
             </w:r>
             <w:proofErr w:type="spellStart"/>
-            <w:proofErr w:type="gramStart"/>
             <w:r>
               <w:rPr>
                 <w:rFonts w:ascii="Times New Roman" w:hAnsi="Times New Roman" w:cs="Times New Roman"/>
@@ -15401,7 +14678,6 @@
               <w:t>satisfactorily</w:t>
             </w:r>
             <w:proofErr w:type="spellEnd"/>
-            <w:proofErr w:type="gramEnd"/>
             <w:r>
               <w:rPr>
                 <w:rFonts w:ascii="Times New Roman" w:hAnsi="Times New Roman" w:cs="Times New Roman"/>
@@ -15438,7 +14714,6 @@
               <w:t>{{</w:t>
             </w:r>
             <w:proofErr w:type="spellStart"/>
-            <w:proofErr w:type="gramStart"/>
             <w:r>
               <w:rPr>
                 <w:rFonts w:ascii="Times New Roman" w:hAnsi="Times New Roman" w:cs="Times New Roman"/>
@@ -15458,7 +14733,6 @@
               <w:t>unsatisfactory</w:t>
             </w:r>
             <w:proofErr w:type="spellEnd"/>
-            <w:proofErr w:type="gramEnd"/>
             <w:r>
               <w:rPr>
                 <w:rFonts w:ascii="Times New Roman" w:hAnsi="Times New Roman" w:cs="Times New Roman"/>
@@ -15787,7 +15061,6 @@
         <w:t>{{</w:t>
       </w:r>
       <w:proofErr w:type="spellStart"/>
-      <w:proofErr w:type="gramStart"/>
       <w:r>
         <w:rPr>
           <w:rFonts w:ascii="Times New Roman" w:hAnsi="Times New Roman" w:cs="Times New Roman"/>
@@ -15798,7 +15071,6 @@
         <w:t>i.number</w:t>
       </w:r>
       <w:proofErr w:type="spellEnd"/>
-      <w:proofErr w:type="gramEnd"/>
       <w:r>
         <w:rPr>
           <w:rFonts w:ascii="Times New Roman" w:hAnsi="Times New Roman" w:cs="Times New Roman"/>
@@ -16174,7 +15446,6 @@
         <w:t>{{</w:t>
       </w:r>
       <w:proofErr w:type="spellStart"/>
-      <w:proofErr w:type="gramStart"/>
       <w:r>
         <w:rPr>
           <w:rFonts w:ascii="Times New Roman" w:hAnsi="Times New Roman" w:cs="Times New Roman"/>
@@ -16185,7 +15456,6 @@
         <w:t>i.number</w:t>
       </w:r>
       <w:proofErr w:type="spellEnd"/>
-      <w:proofErr w:type="gramEnd"/>
       <w:r>
         <w:rPr>
           <w:rFonts w:ascii="Times New Roman" w:hAnsi="Times New Roman" w:cs="Times New Roman"/>
@@ -16242,7 +15512,6 @@
           <w:rFonts w:ascii="Times New Roman" w:hAnsi="Times New Roman" w:cs="Times New Roman"/>
           <w:sz w:val="24"/>
           <w:szCs w:val="24"/>
-          <w:lang w:val="en-US"/>
         </w:rPr>
       </w:pPr>
       <w:r>
@@ -16250,7 +15519,6 @@
           <w:rFonts w:ascii="Times New Roman" w:hAnsi="Times New Roman" w:cs="Times New Roman"/>
           <w:sz w:val="24"/>
           <w:szCs w:val="24"/>
-          <w:lang w:val="en-US"/>
         </w:rPr>
         <w:t>{%</w:t>
       </w:r>
@@ -16259,7 +15527,6 @@
           <w:rFonts w:ascii="Times New Roman" w:hAnsi="Times New Roman" w:cs="Times New Roman"/>
           <w:sz w:val="24"/>
           <w:szCs w:val="24"/>
-          <w:lang w:val="en-US"/>
         </w:rPr>
         <w:t>-</w:t>
       </w:r>
@@ -16268,7 +15535,6 @@
           <w:rFonts w:ascii="Times New Roman" w:hAnsi="Times New Roman" w:cs="Times New Roman"/>
           <w:sz w:val="24"/>
           <w:szCs w:val="24"/>
-          <w:lang w:val="en-US"/>
         </w:rPr>
         <w:t xml:space="preserve"> </w:t>
       </w:r>
@@ -16288,7 +15554,6 @@
           <w:rFonts w:ascii="Times New Roman" w:hAnsi="Times New Roman" w:cs="Times New Roman"/>
           <w:sz w:val="24"/>
           <w:szCs w:val="24"/>
-          <w:lang w:val="en-US"/>
         </w:rPr>
         <w:t xml:space="preserve"> %}</w:t>
       </w:r>
@@ -16303,7 +15568,6 @@
           <w:bCs/>
           <w:sz w:val="24"/>
           <w:szCs w:val="24"/>
-          <w:lang w:val="en-US"/>
         </w:rPr>
       </w:pPr>
       <w:r>
@@ -16313,7 +15577,6 @@
           <w:bCs/>
           <w:sz w:val="24"/>
           <w:szCs w:val="24"/>
-          <w:lang w:val="en-US"/>
         </w:rPr>
         <w:t>8</w:t>
       </w:r>
@@ -16324,7 +15587,6 @@
           <w:bCs/>
           <w:sz w:val="24"/>
           <w:szCs w:val="24"/>
-          <w:lang w:val="en-US"/>
         </w:rPr>
         <w:t xml:space="preserve"> </w:t>
       </w:r>
@@ -16345,7 +15607,6 @@
           <w:bCs/>
           <w:sz w:val="24"/>
           <w:szCs w:val="24"/>
-          <w:lang w:val="en-US"/>
         </w:rPr>
         <w:t xml:space="preserve"> </w:t>
       </w:r>
@@ -16366,7 +15627,6 @@
           <w:bCs/>
           <w:sz w:val="24"/>
           <w:szCs w:val="24"/>
-          <w:lang w:val="en-US"/>
         </w:rPr>
         <w:t xml:space="preserve"> </w:t>
       </w:r>
@@ -16390,7 +15650,6 @@
           <w:szCs w:val="24"/>
         </w:rPr>
       </w:pPr>
-      <w:proofErr w:type="gramStart"/>
       <w:r>
         <w:rPr>
           <w:rFonts w:ascii="Times New Roman" w:hAnsi="Times New Roman" w:cs="Times New Roman"/>
@@ -16425,7 +15684,6 @@
         </w:rPr>
         <w:t>web</w:t>
       </w:r>
-      <w:proofErr w:type="gramEnd"/>
       <w:r>
         <w:rPr>
           <w:rFonts w:ascii="Times New Roman" w:hAnsi="Times New Roman" w:cs="Times New Roman"/>
@@ -16487,7 +15745,6 @@
           <w:szCs w:val="24"/>
         </w:rPr>
       </w:pPr>
-      <w:proofErr w:type="gramStart"/>
       <w:r>
         <w:rPr>
           <w:rFonts w:ascii="Times New Roman" w:hAnsi="Times New Roman" w:cs="Times New Roman"/>
@@ -16522,7 +15779,6 @@
         </w:rPr>
         <w:t>bd</w:t>
       </w:r>
-      <w:proofErr w:type="gramEnd"/>
       <w:r>
         <w:rPr>
           <w:rFonts w:ascii="Times New Roman" w:hAnsi="Times New Roman" w:cs="Times New Roman"/>
@@ -16689,6 +15945,7 @@
           <w:bCs/>
           <w:sz w:val="24"/>
           <w:szCs w:val="24"/>
+          <w:lang w:val="en-US"/>
         </w:rPr>
       </w:pPr>
       <w:r>
@@ -16702,7 +15959,6 @@
         <w:t>{{</w:t>
       </w:r>
       <w:proofErr w:type="spellStart"/>
-      <w:proofErr w:type="gramStart"/>
       <w:r>
         <w:rPr>
           <w:rFonts w:ascii="Times New Roman" w:hAnsi="Times New Roman" w:cs="Times New Roman"/>
@@ -16714,7 +15970,6 @@
         <w:t>i.number</w:t>
       </w:r>
       <w:proofErr w:type="spellEnd"/>
-      <w:proofErr w:type="gramEnd"/>
       <w:r>
         <w:rPr>
           <w:rFonts w:ascii="Times New Roman" w:hAnsi="Times New Roman" w:cs="Times New Roman"/>
@@ -16731,11 +15986,11 @@
           <w:bCs/>
           <w:sz w:val="24"/>
           <w:szCs w:val="24"/>
+          <w:lang w:val="en-US"/>
         </w:rPr>
         <w:t>{{</w:t>
       </w:r>
       <w:proofErr w:type="spellStart"/>
-      <w:proofErr w:type="gramStart"/>
       <w:r>
         <w:rPr>
           <w:rFonts w:ascii="Times New Roman" w:hAnsi="Times New Roman" w:cs="Times New Roman"/>
@@ -16746,6 +16001,26 @@
         </w:rPr>
         <w:t>i</w:t>
       </w:r>
+      <w:r>
+        <w:rPr>
+          <w:rFonts w:ascii="Times New Roman" w:hAnsi="Times New Roman" w:cs="Times New Roman"/>
+          <w:bCs/>
+          <w:sz w:val="24"/>
+          <w:szCs w:val="24"/>
+          <w:lang w:val="en-US"/>
+        </w:rPr>
+        <w:t>.</w:t>
+      </w:r>
+      <w:r>
+        <w:rPr>
+          <w:rFonts w:ascii="Times New Roman" w:hAnsi="Times New Roman" w:cs="Times New Roman"/>
+          <w:bCs/>
+          <w:sz w:val="24"/>
+          <w:szCs w:val="24"/>
+          <w:lang w:val="en-US"/>
+        </w:rPr>
+        <w:t>content</w:t>
+      </w:r>
       <w:proofErr w:type="spellEnd"/>
       <w:r>
         <w:rPr>
@@ -16753,26 +16028,7 @@
           <w:bCs/>
           <w:sz w:val="24"/>
           <w:szCs w:val="24"/>
-        </w:rPr>
-        <w:t>.</w:t>
-      </w:r>
-      <w:r>
-        <w:rPr>
-          <w:rFonts w:ascii="Times New Roman" w:hAnsi="Times New Roman" w:cs="Times New Roman"/>
-          <w:bCs/>
-          <w:sz w:val="24"/>
-          <w:szCs w:val="24"/>
-          <w:lang w:val="en-US"/>
-        </w:rPr>
-        <w:t>content</w:t>
-      </w:r>
-      <w:proofErr w:type="gramEnd"/>
-      <w:r>
-        <w:rPr>
-          <w:rFonts w:ascii="Times New Roman" w:hAnsi="Times New Roman" w:cs="Times New Roman"/>
-          <w:bCs/>
-          <w:sz w:val="24"/>
-          <w:szCs w:val="24"/>
+          <w:lang w:val="en-US"/>
         </w:rPr>
         <w:t>}}</w:t>
       </w:r>
@@ -16786,6 +16042,7 @@
           <w:bCs/>
           <w:sz w:val="24"/>
           <w:szCs w:val="24"/>
+          <w:lang w:val="en-US"/>
         </w:rPr>
       </w:pPr>
       <w:r>
@@ -16794,6 +16051,7 @@
           <w:bCs/>
           <w:sz w:val="24"/>
           <w:szCs w:val="24"/>
+          <w:lang w:val="en-US"/>
         </w:rPr>
         <w:t>{%</w:t>
       </w:r>
@@ -16803,6 +16061,7 @@
           <w:bCs/>
           <w:sz w:val="24"/>
           <w:szCs w:val="24"/>
+          <w:lang w:val="en-US"/>
         </w:rPr>
         <w:t>-</w:t>
       </w:r>
@@ -16812,6 +16071,7 @@
           <w:bCs/>
           <w:sz w:val="24"/>
           <w:szCs w:val="24"/>
+          <w:lang w:val="en-US"/>
         </w:rPr>
         <w:t xml:space="preserve"> </w:t>
       </w:r>
@@ -16833,6 +16093,7 @@
           <w:bCs/>
           <w:sz w:val="24"/>
           <w:szCs w:val="24"/>
+          <w:lang w:val="en-US"/>
         </w:rPr>
         <w:t xml:space="preserve"> %}</w:t>
       </w:r>
@@ -16896,7 +16157,6 @@
           <w:bCs/>
           <w:sz w:val="24"/>
           <w:szCs w:val="24"/>
-          <w:lang w:val="en-US"/>
         </w:rPr>
       </w:pPr>
       <w:r>
@@ -16905,7 +16165,6 @@
           <w:bCs/>
           <w:sz w:val="24"/>
           <w:szCs w:val="24"/>
-          <w:lang w:val="en-US"/>
         </w:rPr>
         <w:t>{%</w:t>
       </w:r>
@@ -16915,7 +16174,6 @@
           <w:bCs/>
           <w:sz w:val="24"/>
           <w:szCs w:val="24"/>
-          <w:lang w:val="en-US"/>
         </w:rPr>
         <w:t>-</w:t>
       </w:r>
@@ -16925,7 +16183,6 @@
           <w:bCs/>
           <w:sz w:val="24"/>
           <w:szCs w:val="24"/>
-          <w:lang w:val="en-US"/>
         </w:rPr>
         <w:t xml:space="preserve"> </w:t>
       </w:r>
@@ -16945,7 +16202,6 @@
           <w:bCs/>
           <w:sz w:val="24"/>
           <w:szCs w:val="24"/>
-          <w:lang w:val="en-US"/>
         </w:rPr>
         <w:t xml:space="preserve"> </w:t>
       </w:r>
@@ -16967,7 +16223,6 @@
           <w:bCs/>
           <w:sz w:val="24"/>
           <w:szCs w:val="24"/>
-          <w:lang w:val="en-US"/>
         </w:rPr>
         <w:t xml:space="preserve"> </w:t>
       </w:r>
@@ -16987,7 +16242,6 @@
           <w:bCs/>
           <w:sz w:val="24"/>
           <w:szCs w:val="24"/>
-          <w:lang w:val="en-US"/>
         </w:rPr>
         <w:t xml:space="preserve"> </w:t>
       </w:r>
@@ -17007,7 +16261,6 @@
           <w:bCs/>
           <w:sz w:val="24"/>
           <w:szCs w:val="24"/>
-          <w:lang w:val="en-US"/>
         </w:rPr>
         <w:t xml:space="preserve"> %}</w:t>
       </w:r>
@@ -17028,12 +16281,10 @@
           <w:bCs/>
           <w:sz w:val="24"/>
           <w:szCs w:val="24"/>
-          <w:lang w:val="en-US"/>
         </w:rPr>
         <w:t>{{</w:t>
       </w:r>
       <w:proofErr w:type="spellStart"/>
-      <w:proofErr w:type="gramStart"/>
       <w:r>
         <w:rPr>
           <w:rFonts w:ascii="Times New Roman" w:hAnsi="Times New Roman" w:cs="Times New Roman"/>
@@ -17044,13 +16295,13 @@
         </w:rPr>
         <w:t>i</w:t>
       </w:r>
-      <w:r>
-        <w:rPr>
-          <w:rFonts w:ascii="Times New Roman" w:hAnsi="Times New Roman" w:cs="Times New Roman"/>
-          <w:bCs/>
-          <w:sz w:val="24"/>
-          <w:szCs w:val="24"/>
-          <w:lang w:val="en-US"/>
+      <w:proofErr w:type="spellEnd"/>
+      <w:r>
+        <w:rPr>
+          <w:rFonts w:ascii="Times New Roman" w:hAnsi="Times New Roman" w:cs="Times New Roman"/>
+          <w:bCs/>
+          <w:sz w:val="24"/>
+          <w:szCs w:val="24"/>
         </w:rPr>
         <w:t>.</w:t>
       </w:r>
@@ -17064,15 +16315,12 @@
         </w:rPr>
         <w:t>number</w:t>
       </w:r>
-      <w:proofErr w:type="spellEnd"/>
-      <w:proofErr w:type="gramEnd"/>
-      <w:r>
-        <w:rPr>
-          <w:rFonts w:ascii="Times New Roman" w:hAnsi="Times New Roman" w:cs="Times New Roman"/>
-          <w:bCs/>
-          <w:sz w:val="24"/>
-          <w:szCs w:val="24"/>
-          <w:lang w:val="en-US"/>
+      <w:r>
+        <w:rPr>
+          <w:rFonts w:ascii="Times New Roman" w:hAnsi="Times New Roman" w:cs="Times New Roman"/>
+          <w:bCs/>
+          <w:sz w:val="24"/>
+          <w:szCs w:val="24"/>
         </w:rPr>
         <w:t xml:space="preserve">}}. </w:t>
       </w:r>
@@ -17307,16 +16555,7 @@
         <w:color w:val="000000" w:themeColor="text1"/>
         <w:sz w:val="24"/>
       </w:rPr>
-      <w:t xml:space="preserve">Год набора – </w:t>
-    </w:r>
-    <w:proofErr w:type="gramStart"/>
-    <w:r>
-      <w:rPr>
-        <w:rFonts w:ascii="Times New Roman" w:hAnsi="Times New Roman" w:cs="Times New Roman"/>
-        <w:color w:val="000000" w:themeColor="text1"/>
-        <w:sz w:val="24"/>
-      </w:rPr>
-      <w:t xml:space="preserve">{{ </w:t>
+      <w:t xml:space="preserve">Год набора – {{ </w:t>
     </w:r>
     <w:r>
       <w:rPr>
@@ -17327,7 +16566,6 @@
       </w:rPr>
       <w:t>year</w:t>
     </w:r>
-    <w:proofErr w:type="gramEnd"/>
     <w:r>
       <w:rPr>
         <w:rFonts w:ascii="Times New Roman" w:hAnsi="Times New Roman" w:cs="Times New Roman"/>
@@ -17336,7 +16574,6 @@
       </w:rPr>
       <w:t>_</w:t>
     </w:r>
-    <w:proofErr w:type="gramStart"/>
     <w:r>
       <w:rPr>
         <w:rFonts w:ascii="Times New Roman" w:hAnsi="Times New Roman" w:cs="Times New Roman"/>
@@ -17352,16 +16589,7 @@
         <w:color w:val="000000" w:themeColor="text1"/>
         <w:sz w:val="24"/>
       </w:rPr>
-      <w:t xml:space="preserve"> }</w:t>
-    </w:r>
-    <w:proofErr w:type="gramEnd"/>
-    <w:r>
-      <w:rPr>
-        <w:rFonts w:ascii="Times New Roman" w:hAnsi="Times New Roman" w:cs="Times New Roman"/>
-        <w:color w:val="000000" w:themeColor="text1"/>
-        <w:sz w:val="24"/>
-      </w:rPr>
-      <w:t>}</w:t>
+      <w:t xml:space="preserve"> }}</w:t>
     </w:r>
   </w:p>
   <w:p>
@@ -17383,7 +16611,6 @@
       </w:rPr>
       <w:t xml:space="preserve">Иркутск, </w:t>
     </w:r>
-    <w:proofErr w:type="gramStart"/>
     <w:r>
       <w:rPr>
         <w:rFonts w:ascii="Times New Roman" w:hAnsi="Times New Roman" w:cs="Times New Roman"/>
@@ -17401,27 +16628,7 @@
         <w:sz w:val="24"/>
         <w:lang w:val="en-US"/>
       </w:rPr>
-      <w:t>protocol</w:t>
-    </w:r>
-    <w:proofErr w:type="gramEnd"/>
-    <w:r>
-      <w:rPr>
-        <w:rFonts w:ascii="Times New Roman" w:hAnsi="Times New Roman" w:cs="Times New Roman"/>
-        <w:color w:val="000000" w:themeColor="text1"/>
-        <w:sz w:val="24"/>
-        <w:lang w:val="en-US"/>
-      </w:rPr>
-      <w:t>_</w:t>
-    </w:r>
-    <w:proofErr w:type="gramStart"/>
-    <w:r>
-      <w:rPr>
-        <w:rFonts w:ascii="Times New Roman" w:hAnsi="Times New Roman" w:cs="Times New Roman"/>
-        <w:color w:val="000000" w:themeColor="text1"/>
-        <w:sz w:val="24"/>
-        <w:lang w:val="en-US"/>
-      </w:rPr>
-      <w:t>year</w:t>
+      <w:t>protocol_year</w:t>
     </w:r>
     <w:proofErr w:type="spellEnd"/>
     <w:r>
@@ -17431,17 +16638,7 @@
         <w:sz w:val="24"/>
         <w:lang w:val="en-US"/>
       </w:rPr>
-      <w:t xml:space="preserve"> }</w:t>
-    </w:r>
-    <w:proofErr w:type="gramEnd"/>
-    <w:r>
-      <w:rPr>
-        <w:rFonts w:ascii="Times New Roman" w:hAnsi="Times New Roman" w:cs="Times New Roman"/>
-        <w:color w:val="000000" w:themeColor="text1"/>
-        <w:sz w:val="24"/>
-        <w:lang w:val="en-US"/>
-      </w:rPr>
-      <w:t>}</w:t>
+      <w:t xml:space="preserve"> }}</w:t>
     </w:r>
     <w:r>
       <w:rPr>

</xml_diff>